<commit_message>
Fixed some rank-changing continuous effect: They get ambiguous when combined with move effect and effect concerned about rank, such as Kamikaze Bot. Modified these effects to clarify them. Quicksand is changed to -> On engage start: Change rank of all cards in its territory to 1. Swamp is changed to -> On turn end: Reduce the rank of all cards in its territory by 1 whose rank is higher than 1. Card effect change: Splash Slime -> Can only rally in adjacent room where at least an ally exists now. Duel -> now set its rank to the rank of the avatar card it replaced. Card change: Lowered the rank of some skill cards. Rule change: Clarify that territory cards' on turn start/end effect resolves before those in the floor zone.
</commit_message>
<xml_diff>
--- a/规则书.docx
+++ b/规则书.docx
@@ -472,13 +472,7 @@
         <w:rPr>
           <w:rFonts w:hint="eastAsia"/>
         </w:rPr>
-        <w:t>原</w:t>
-      </w:r>
-      <w:r>
-        <w:rPr>
-          <w:rFonts w:hint="eastAsia"/>
-        </w:rPr>
-        <w:t>生</w:t>
+        <w:t>叛军</w:t>
       </w:r>
       <w:r>
         <w:rPr>
@@ -502,19 +496,25 @@
         <w:rPr>
           <w:rFonts w:hint="eastAsia"/>
         </w:rPr>
-        <w:t>玩家阵营，在原生侧的牌视为在</w:t>
-      </w:r>
-      <w:r>
-        <w:rPr>
-          <w:rFonts w:hint="eastAsia"/>
-        </w:rPr>
-        <w:t>原</w:t>
-      </w:r>
-      <w:r>
-        <w:rPr>
-          <w:rFonts w:hint="eastAsia"/>
-        </w:rPr>
-        <w:t>生</w:t>
+        <w:t>玩家阵营，在</w:t>
+      </w:r>
+      <w:r>
+        <w:rPr>
+          <w:rFonts w:hint="eastAsia"/>
+        </w:rPr>
+        <w:t>叛军</w:t>
+      </w:r>
+      <w:r>
+        <w:rPr>
+          <w:rFonts w:hint="eastAsia"/>
+        </w:rPr>
+        <w:t>侧的牌视为在</w:t>
+      </w:r>
+      <w:r>
+        <w:rPr>
+          <w:rFonts w:hint="eastAsia"/>
+        </w:rPr>
+        <w:t>叛军</w:t>
       </w:r>
       <w:r>
         <w:rPr>
@@ -686,13 +686,19 @@
         <w:rPr>
           <w:rFonts w:hint="eastAsia"/>
         </w:rPr>
-        <w:t>原生</w:t>
-      </w:r>
-      <w:r>
-        <w:rPr>
-          <w:rFonts w:hint="eastAsia"/>
-        </w:rPr>
-        <w:t>势力的牌时，</w:t>
+        <w:t>叛军</w:t>
+      </w:r>
+      <w:r>
+        <w:rPr>
+          <w:rFonts w:hint="eastAsia"/>
+        </w:rPr>
+        <w:t>阵营</w:t>
+      </w:r>
+      <w:r>
+        <w:rPr>
+          <w:rFonts w:hint="eastAsia"/>
+        </w:rPr>
+        <w:t>的牌时，</w:t>
       </w:r>
       <w:r>
         <w:rPr>
@@ -3187,7 +3193,7 @@
         <w:rPr>
           <w:rFonts w:hint="eastAsia"/>
         </w:rPr>
-        <w:t>原生</w:t>
+        <w:t>叛军</w:t>
       </w:r>
       <w:r>
         <w:rPr>
@@ -3596,68 +3602,7 @@
         <w:rPr>
           <w:rFonts w:hint="eastAsia"/>
         </w:rPr>
-        <w:t>玩家</w:t>
-      </w:r>
-      <w:r>
-        <w:rPr>
-          <w:rFonts w:hint="eastAsia"/>
-        </w:rPr>
-        <w:t>依次指定楼层区的所有房间，按照指定的顺序检查每个房间，结算房间内所有牌的</w:t>
-      </w:r>
-      <w:r>
-        <w:rPr>
-          <w:rFonts w:hint="eastAsia"/>
-        </w:rPr>
-        <w:t>回合开始时效果</w:t>
-      </w:r>
-      <w:r>
-        <w:rPr>
-          <w:rFonts w:hint="eastAsia"/>
-        </w:rPr>
-        <w:t>。房间内有多张牌具有回合开始时效果时，按照标准顺序依次结算</w:t>
-      </w:r>
-      <w:r>
-        <w:rPr>
-          <w:rFonts w:hint="eastAsia"/>
-        </w:rPr>
-        <w:t>。</w:t>
-      </w:r>
-      <w:r>
-        <w:rPr>
-          <w:rFonts w:hint="eastAsia"/>
-        </w:rPr>
-        <w:t>一张牌的回合开始时</w:t>
-      </w:r>
-      <w:r>
-        <w:rPr>
-          <w:rFonts w:hint="eastAsia"/>
-        </w:rPr>
-        <w:t>效果结算完成后，将</w:t>
-      </w:r>
-      <w:r>
-        <w:rPr>
-          <w:rFonts w:hint="eastAsia"/>
-        </w:rPr>
-        <w:t>其</w:t>
-      </w:r>
-      <w:r>
-        <w:rPr>
-          <w:rFonts w:hint="eastAsia"/>
-        </w:rPr>
-        <w:t>翻面。</w:t>
-      </w:r>
-      <w:r>
-        <w:rPr>
-          <w:rFonts w:hint="eastAsia"/>
-        </w:rPr>
-        <w:t>这一步中，</w:t>
-      </w:r>
-      <w:r>
-        <w:rPr>
-          <w:rFonts w:hint="eastAsia"/>
-        </w:rPr>
-        <w:lastRenderedPageBreak/>
-        <w:t>横置的牌以及翻面的牌不结算效果。</w:t>
+        <w:t>按照从上到下，再从左到右的顺序，结算奖励区所有牌的回合开始时效果。</w:t>
       </w:r>
     </w:p>
     <w:p>
@@ -3675,6 +3620,91 @@
         <w:rPr>
           <w:rFonts w:hint="eastAsia"/>
         </w:rPr>
+        <w:t>玩家</w:t>
+      </w:r>
+      <w:r>
+        <w:rPr>
+          <w:rFonts w:hint="eastAsia"/>
+        </w:rPr>
+        <w:t>依次指定楼层区的所有房间，按照指定的顺序检查每个房间，结算房间内所有牌的</w:t>
+      </w:r>
+      <w:r>
+        <w:rPr>
+          <w:rFonts w:hint="eastAsia"/>
+        </w:rPr>
+        <w:t>回合开始时效果</w:t>
+      </w:r>
+      <w:r>
+        <w:rPr>
+          <w:rFonts w:hint="eastAsia"/>
+        </w:rPr>
+        <w:t>。房间内有多张牌具有回合开始时效果时，按照标准</w:t>
+      </w:r>
+      <w:r>
+        <w:rPr>
+          <w:rFonts w:hint="eastAsia"/>
+        </w:rPr>
+        <w:lastRenderedPageBreak/>
+        <w:t>顺序依次结算</w:t>
+      </w:r>
+      <w:r>
+        <w:rPr>
+          <w:rFonts w:hint="eastAsia"/>
+        </w:rPr>
+        <w:t>。</w:t>
+      </w:r>
+      <w:r>
+        <w:rPr>
+          <w:rFonts w:hint="eastAsia"/>
+        </w:rPr>
+        <w:t>一张牌的回合开始时</w:t>
+      </w:r>
+      <w:r>
+        <w:rPr>
+          <w:rFonts w:hint="eastAsia"/>
+        </w:rPr>
+        <w:t>效果结算完成后，将</w:t>
+      </w:r>
+      <w:r>
+        <w:rPr>
+          <w:rFonts w:hint="eastAsia"/>
+        </w:rPr>
+        <w:t>其</w:t>
+      </w:r>
+      <w:r>
+        <w:rPr>
+          <w:rFonts w:hint="eastAsia"/>
+        </w:rPr>
+        <w:t>翻面。</w:t>
+      </w:r>
+      <w:r>
+        <w:rPr>
+          <w:rFonts w:hint="eastAsia"/>
+        </w:rPr>
+        <w:t>这一步中，</w:t>
+      </w:r>
+      <w:r>
+        <w:rPr>
+          <w:rFonts w:hint="eastAsia"/>
+        </w:rPr>
+        <w:t>横置的牌以及翻面的牌不结算效果。</w:t>
+      </w:r>
+    </w:p>
+    <w:p>
+      <w:pPr>
+        <w:pStyle w:val="a9"/>
+        <w:numPr>
+          <w:ilvl w:val="0"/>
+          <w:numId w:val="14"/>
+        </w:numPr>
+        <w:rPr>
+          <w:rFonts w:hint="eastAsia"/>
+        </w:rPr>
+      </w:pPr>
+      <w:r>
+        <w:rPr>
+          <w:rFonts w:hint="eastAsia"/>
+        </w:rPr>
         <w:t>将</w:t>
       </w:r>
       <w:r>
@@ -4033,7 +4063,19 @@
         <w:rPr>
           <w:rFonts w:hint="eastAsia"/>
         </w:rPr>
-        <w:t>当楼层区没有原生阵营的牌时，</w:t>
+        <w:t>当楼层区没有</w:t>
+      </w:r>
+      <w:r>
+        <w:rPr>
+          <w:rFonts w:hint="eastAsia"/>
+        </w:rPr>
+        <w:t>叛军</w:t>
+      </w:r>
+      <w:r>
+        <w:rPr>
+          <w:rFonts w:hint="eastAsia"/>
+        </w:rPr>
+        <w:t>阵营的牌时，</w:t>
       </w:r>
       <w:r>
         <w:rPr>
@@ -4111,7 +4153,13 @@
         <w:rPr>
           <w:rFonts w:hint="eastAsia"/>
         </w:rPr>
-        <w:t>原生侧</w:t>
+        <w:t>叛军</w:t>
+      </w:r>
+      <w:r>
+        <w:rPr>
+          <w:rFonts w:hint="eastAsia"/>
+        </w:rPr>
+        <w:t>侧</w:t>
       </w:r>
       <w:r>
         <w:rPr>
@@ -4314,6 +4362,7 @@
         <w:rPr>
           <w:rFonts w:hint="eastAsia"/>
         </w:rPr>
+        <w:lastRenderedPageBreak/>
         <w:t>打出化身牌</w:t>
       </w:r>
     </w:p>
@@ -4348,14 +4397,7 @@
         <w:rPr>
           <w:rFonts w:hint="eastAsia"/>
         </w:rPr>
-        <w:t>以创造1张化身牌，并将其打出到</w:t>
-      </w:r>
-      <w:r>
-        <w:rPr>
-          <w:rFonts w:hint="eastAsia"/>
-        </w:rPr>
-        <w:lastRenderedPageBreak/>
-        <w:t>楼层区任意房间的玩家侧</w:t>
+        <w:t>以创造1张化身牌，并将其打出到楼层区任意房间的玩家侧</w:t>
       </w:r>
       <w:r>
         <w:rPr>
@@ -4763,7 +4805,13 @@
         <w:rPr>
           <w:rFonts w:hint="eastAsia"/>
         </w:rPr>
-        <w:t>原生侧</w:t>
+        <w:t>叛军</w:t>
+      </w:r>
+      <w:r>
+        <w:rPr>
+          <w:rFonts w:hint="eastAsia"/>
+        </w:rPr>
+        <w:t>侧</w:t>
       </w:r>
       <w:r>
         <w:rPr>
@@ -4823,7 +4871,13 @@
         <w:rPr>
           <w:rFonts w:hint="eastAsia"/>
         </w:rPr>
-        <w:t>原生侧</w:t>
+        <w:t>叛军</w:t>
+      </w:r>
+      <w:r>
+        <w:rPr>
+          <w:rFonts w:hint="eastAsia"/>
+        </w:rPr>
+        <w:t>侧</w:t>
       </w:r>
       <w:r>
         <w:rPr>
@@ -4890,7 +4944,13 @@
         <w:rPr>
           <w:rFonts w:hint="eastAsia"/>
         </w:rPr>
-        <w:t>原生侧</w:t>
+        <w:t>叛军</w:t>
+      </w:r>
+      <w:r>
+        <w:rPr>
+          <w:rFonts w:hint="eastAsia"/>
+        </w:rPr>
+        <w:t>侧</w:t>
       </w:r>
       <w:r>
         <w:rPr>
@@ -4920,7 +4980,13 @@
         <w:rPr>
           <w:rFonts w:hint="eastAsia"/>
         </w:rPr>
-        <w:t>原生侧</w:t>
+        <w:t>叛军</w:t>
+      </w:r>
+      <w:r>
+        <w:rPr>
+          <w:rFonts w:hint="eastAsia"/>
+        </w:rPr>
+        <w:t>侧</w:t>
       </w:r>
       <w:r>
         <w:rPr>
@@ -5004,7 +5070,19 @@
         <w:rPr>
           <w:rFonts w:hint="eastAsia"/>
         </w:rPr>
-        <w:t>按标准顺序消灭原生侧所有牌，再按标准顺序消灭玩家侧所有牌</w:t>
+        <w:t>按标准顺序消灭</w:t>
+      </w:r>
+      <w:r>
+        <w:rPr>
+          <w:rFonts w:hint="eastAsia"/>
+        </w:rPr>
+        <w:t>叛军</w:t>
+      </w:r>
+      <w:r>
+        <w:rPr>
+          <w:rFonts w:hint="eastAsia"/>
+        </w:rPr>
+        <w:t>侧所有牌，再按标准顺序消灭玩家侧所有牌</w:t>
       </w:r>
       <w:r>
         <w:rPr>
@@ -5102,7 +5180,13 @@
         <w:rPr>
           <w:rFonts w:hint="eastAsia"/>
         </w:rPr>
-        <w:t>原生阵营的</w:t>
+        <w:t>叛军</w:t>
+      </w:r>
+      <w:r>
+        <w:rPr>
+          <w:rFonts w:hint="eastAsia"/>
+        </w:rPr>
+        <w:t>阵营的</w:t>
       </w:r>
       <w:r>
         <w:rPr>
@@ -5174,7 +5258,13 @@
         <w:rPr>
           <w:rFonts w:hint="eastAsia"/>
         </w:rPr>
-        <w:t>原生阵营的</w:t>
+        <w:t>叛军</w:t>
+      </w:r>
+      <w:r>
+        <w:rPr>
+          <w:rFonts w:hint="eastAsia"/>
+        </w:rPr>
+        <w:t>阵营的</w:t>
       </w:r>
       <w:r>
         <w:rPr>
@@ -5234,6 +5324,7 @@
         <w:rPr>
           <w:rFonts w:hint="eastAsia"/>
         </w:rPr>
+        <w:lastRenderedPageBreak/>
         <w:t>根据墓地牌的数量，</w:t>
       </w:r>
       <w:r>
@@ -5318,7 +5409,6 @@
         <w:rPr>
           <w:rFonts w:hint="eastAsia"/>
         </w:rPr>
-        <w:lastRenderedPageBreak/>
         <w:t>玩家回复</w:t>
       </w:r>
       <w:r>
@@ -5521,19 +5611,7 @@
         <w:rPr>
           <w:rFonts w:hint="eastAsia"/>
         </w:rPr>
-        <w:t>玩家依次指定楼层区的所有房间，按照指定的顺序检查每个房间，结算房间内所有牌的回合结束时效果。房间内有多张牌具有回合开始时效果时，按照标准顺序依次结算。一张牌的回合</w:t>
-      </w:r>
-      <w:r>
-        <w:rPr>
-          <w:rFonts w:hint="eastAsia"/>
-        </w:rPr>
-        <w:t>结束</w:t>
-      </w:r>
-      <w:r>
-        <w:rPr>
-          <w:rFonts w:hint="eastAsia"/>
-        </w:rPr>
-        <w:t>时效果结算完成后，将其翻面。这一步中，横置的牌以及翻面的牌不结算效果。</w:t>
+        <w:t>按照从上到下，再从左到右的顺序，结算奖励区所有牌的回合开始时效果。</w:t>
       </w:r>
     </w:p>
     <w:p>
@@ -5551,6 +5629,36 @@
         <w:rPr>
           <w:rFonts w:hint="eastAsia"/>
         </w:rPr>
+        <w:t>玩家依次指定楼层区的所有房间，按照指定的顺序检查每个房间，结算房间内所有牌的回合结束时效果。房间内有多张牌具有回合开始时效果时，按照标准顺序依次结算。一张牌的回合</w:t>
+      </w:r>
+      <w:r>
+        <w:rPr>
+          <w:rFonts w:hint="eastAsia"/>
+        </w:rPr>
+        <w:t>结束</w:t>
+      </w:r>
+      <w:r>
+        <w:rPr>
+          <w:rFonts w:hint="eastAsia"/>
+        </w:rPr>
+        <w:t>时效果结算完成后，将其翻面。这一步中，横置的牌以及翻面的牌不结算效果。</w:t>
+      </w:r>
+    </w:p>
+    <w:p>
+      <w:pPr>
+        <w:pStyle w:val="a9"/>
+        <w:numPr>
+          <w:ilvl w:val="0"/>
+          <w:numId w:val="11"/>
+        </w:numPr>
+        <w:rPr>
+          <w:rFonts w:hint="eastAsia"/>
+        </w:rPr>
+      </w:pPr>
+      <w:r>
+        <w:rPr>
+          <w:rFonts w:hint="eastAsia"/>
+        </w:rPr>
         <w:t>将</w:t>
       </w:r>
       <w:r>
@@ -5792,7 +5900,31 @@
         <w:rPr>
           <w:rFonts w:hint="eastAsia"/>
         </w:rPr>
-        <w:t>房间内有原生侧和玩家侧，先结算原生侧，再结算玩家侧。每一侧可能有数张牌，先结算最前置位，再依次结算到最后置位。</w:t>
+        <w:t>房间内有</w:t>
+      </w:r>
+      <w:r>
+        <w:rPr>
+          <w:rFonts w:hint="eastAsia"/>
+        </w:rPr>
+        <w:t>叛军</w:t>
+      </w:r>
+      <w:r>
+        <w:rPr>
+          <w:rFonts w:hint="eastAsia"/>
+        </w:rPr>
+        <w:t>侧和玩家侧，先结算</w:t>
+      </w:r>
+      <w:r>
+        <w:rPr>
+          <w:rFonts w:hint="eastAsia"/>
+        </w:rPr>
+        <w:t>叛军</w:t>
+      </w:r>
+      <w:r>
+        <w:rPr>
+          <w:rFonts w:hint="eastAsia"/>
+        </w:rPr>
+        <w:t>侧，再结算玩家侧。每一侧可能有数张牌，先结算最前置位，再依次结算到最后置位。</w:t>
       </w:r>
     </w:p>
     <w:p>
@@ -5878,6 +6010,7 @@
         <w:rPr>
           <w:rFonts w:hint="eastAsia"/>
         </w:rPr>
+        <w:lastRenderedPageBreak/>
         <w:t>用语：</w:t>
       </w:r>
       <w:r>
@@ -6028,26 +6161,611 @@
         </w:rPr>
       </w:pPr>
       <w:r>
+        <w:tab/>
+      </w:r>
+      <w:r>
+        <w:rPr>
+          <w:rFonts w:hint="eastAsia"/>
+        </w:rPr>
+        <w:t>牌通过移动进入一个房间，称为移入，反之称为移出。玩家出牌、牌堆发牌不</w:t>
+      </w:r>
+      <w:r>
+        <w:rPr>
+          <w:rFonts w:hint="eastAsia"/>
+        </w:rPr>
+        <w:t>视为</w:t>
+      </w:r>
+      <w:r>
+        <w:rPr>
+          <w:rFonts w:hint="eastAsia"/>
+        </w:rPr>
+        <w:t>移入移出。</w:t>
+      </w:r>
+    </w:p>
+    <w:p>
+      <w:pPr>
+        <w:pStyle w:val="3"/>
+        <w:rPr>
+          <w:rFonts w:hint="eastAsia"/>
+        </w:rPr>
+      </w:pPr>
+      <w:r>
+        <w:rPr>
+          <w:rFonts w:hint="eastAsia"/>
+        </w:rPr>
+        <w:t>用语：交换</w:t>
+      </w:r>
+    </w:p>
+    <w:p>
+      <w:pPr>
+        <w:rPr>
+          <w:rFonts w:hint="eastAsia"/>
+        </w:rPr>
+      </w:pPr>
+      <w:r>
+        <w:tab/>
+      </w:r>
+      <w:r>
+        <w:rPr>
+          <w:rFonts w:hint="eastAsia"/>
+        </w:rPr>
+        <w:t>游戏中部分效果可以</w:t>
+      </w:r>
+      <w:r>
+        <w:rPr>
+          <w:rFonts w:hint="eastAsia"/>
+        </w:rPr>
+        <w:t>将两张牌</w:t>
+      </w:r>
+      <w:r>
+        <w:rPr>
+          <w:rFonts w:hint="eastAsia"/>
+        </w:rPr>
+        <w:t>的位置交换，牌的交换也视作移动，交换双方均有一次移入和一次移出，会触发相应的效果。</w:t>
+      </w:r>
+    </w:p>
+    <w:p>
+      <w:pPr>
+        <w:pStyle w:val="3"/>
+        <w:rPr>
+          <w:rFonts w:hint="eastAsia"/>
+        </w:rPr>
+      </w:pPr>
+      <w:r>
+        <w:rPr>
+          <w:rFonts w:hint="eastAsia"/>
+        </w:rPr>
+        <w:t>用语：一半</w:t>
+      </w:r>
+    </w:p>
+    <w:p>
+      <w:pPr>
+        <w:rPr>
+          <w:rFonts w:hint="eastAsia"/>
+        </w:rPr>
+      </w:pPr>
+      <w:r>
+        <w:tab/>
+      </w:r>
+      <w:r>
+        <w:rPr>
+          <w:rFonts w:hint="eastAsia"/>
+        </w:rPr>
+        <w:t>本游戏中，</w:t>
+      </w:r>
+      <w:r>
+        <w:rPr>
+          <w:rFonts w:hint="eastAsia"/>
+        </w:rPr>
+        <w:t>奇数的一半默认情况下向上取整。</w:t>
+      </w:r>
+    </w:p>
+    <w:p>
+      <w:pPr>
+        <w:pStyle w:val="3"/>
+        <w:rPr>
+          <w:rFonts w:hint="eastAsia"/>
+        </w:rPr>
+      </w:pPr>
+      <w:r>
+        <w:rPr>
+          <w:rFonts w:hint="eastAsia"/>
+        </w:rPr>
+        <w:t>用语：</w:t>
+      </w:r>
+      <w:r>
+        <w:rPr>
+          <w:rFonts w:hint="eastAsia"/>
+        </w:rPr>
+        <w:t>翻</w:t>
+      </w:r>
+      <w:r>
+        <w:rPr>
+          <w:rFonts w:hint="eastAsia"/>
+        </w:rPr>
+        <w:t>选</w:t>
+      </w:r>
+    </w:p>
+    <w:p>
+      <w:pPr>
+        <w:rPr>
+          <w:rFonts w:hint="eastAsia"/>
+        </w:rPr>
+      </w:pPr>
+      <w:r>
+        <w:tab/>
+      </w:r>
+      <w:r>
+        <w:rPr>
+          <w:rFonts w:hint="eastAsia"/>
+        </w:rPr>
+        <w:t>指从牌堆中翻开</w:t>
+      </w:r>
+      <w:r>
+        <w:rPr>
+          <w:rFonts w:hint="eastAsia"/>
+        </w:rPr>
+        <w:t>数</w:t>
+      </w:r>
+      <w:r>
+        <w:rPr>
+          <w:rFonts w:hint="eastAsia"/>
+        </w:rPr>
+        <w:t>张牌</w:t>
+      </w:r>
+      <w:r>
+        <w:rPr>
+          <w:rFonts w:hint="eastAsia"/>
+        </w:rPr>
+        <w:t>后</w:t>
+      </w:r>
+      <w:r>
+        <w:rPr>
+          <w:rFonts w:hint="eastAsia"/>
+        </w:rPr>
+        <w:t>，</w:t>
+      </w:r>
+      <w:r>
+        <w:rPr>
+          <w:rFonts w:hint="eastAsia"/>
+        </w:rPr>
+        <w:t>再</w:t>
+      </w:r>
+      <w:r>
+        <w:rPr>
+          <w:rFonts w:hint="eastAsia"/>
+        </w:rPr>
+        <w:t>选</w:t>
+      </w:r>
+      <w:r>
+        <w:rPr>
+          <w:rFonts w:hint="eastAsia"/>
+        </w:rPr>
+        <w:t>其中的某几张</w:t>
+      </w:r>
+      <w:r>
+        <w:rPr>
+          <w:rFonts w:hint="eastAsia"/>
+        </w:rPr>
+        <w:t>。</w:t>
+      </w:r>
+      <w:r>
+        <w:rPr>
+          <w:rFonts w:hint="eastAsia"/>
+        </w:rPr>
+        <w:t>当</w:t>
+      </w:r>
+      <w:r>
+        <w:rPr>
+          <w:rFonts w:hint="eastAsia"/>
+        </w:rPr>
+        <w:t>规则或效果文本要求玩家从某个牌堆</w:t>
+      </w:r>
+      <w:r>
+        <w:rPr>
+          <w:rFonts w:hint="eastAsia"/>
+        </w:rPr>
+        <w:t>翻</w:t>
+      </w:r>
+      <w:r>
+        <w:rPr>
+          <w:rFonts w:hint="eastAsia"/>
+        </w:rPr>
+        <w:t>选</w:t>
+      </w:r>
+      <w:r>
+        <w:rPr>
+          <w:rFonts w:hint="eastAsia"/>
+        </w:rPr>
+        <w:t>时，如果没有额外的</w:t>
+      </w:r>
+      <w:r>
+        <w:rPr>
+          <w:rFonts w:hint="eastAsia"/>
+        </w:rPr>
+        <w:t>说明，</w:t>
+      </w:r>
+      <w:r>
+        <w:rPr>
+          <w:rFonts w:hint="eastAsia"/>
+        </w:rPr>
+        <w:t>没有被选中的牌</w:t>
+      </w:r>
+      <w:r>
+        <w:rPr>
+          <w:rFonts w:hint="eastAsia"/>
+        </w:rPr>
+        <w:t>洗回原牌堆</w:t>
+      </w:r>
+      <w:r>
+        <w:rPr>
+          <w:rFonts w:hint="eastAsia"/>
+        </w:rPr>
+        <w:t>。</w:t>
+      </w:r>
+    </w:p>
+    <w:p>
+      <w:pPr>
+        <w:rPr>
+          <w:rFonts w:hint="eastAsia"/>
+        </w:rPr>
+      </w:pPr>
+      <w:r>
+        <w:tab/>
+      </w:r>
+      <w:r>
+        <w:rPr>
+          <w:rFonts w:hint="eastAsia"/>
+        </w:rPr>
+        <w:t>没有特别说明的情况下，玩家翻开牌后，可以消耗金币，重抽其中任意张牌，称为重翻。没有特别说明的情况下，每次翻选的第一次重翻消耗</w:t>
+      </w:r>
+      <w:r>
+        <w:rPr>
+          <w:rFonts w:hint="eastAsia"/>
+        </w:rPr>
+        <w:t>2</w:t>
+      </w:r>
+      <w:r>
+        <w:rPr>
+          <w:rFonts w:hint="eastAsia"/>
+        </w:rPr>
+        <w:t>金币，之后每多进行</w:t>
+      </w:r>
+      <w:r>
+        <w:rPr>
+          <w:rFonts w:hint="eastAsia"/>
+        </w:rPr>
+        <w:t>一</w:t>
+      </w:r>
+      <w:r>
+        <w:rPr>
+          <w:rFonts w:hint="eastAsia"/>
+        </w:rPr>
+        <w:t>次重翻，消耗金币加1。</w:t>
+      </w:r>
+    </w:p>
+    <w:p>
+      <w:pPr>
+        <w:pStyle w:val="3"/>
+        <w:rPr>
+          <w:rFonts w:hint="eastAsia"/>
+        </w:rPr>
+      </w:pPr>
+      <w:r>
+        <w:rPr>
+          <w:rFonts w:hint="eastAsia"/>
+        </w:rPr>
+        <w:t>用语：横置</w:t>
+      </w:r>
+    </w:p>
+    <w:p>
+      <w:pPr>
+        <w:rPr>
+          <w:rFonts w:hint="eastAsia"/>
+        </w:rPr>
+      </w:pPr>
+      <w:r>
+        <w:tab/>
+      </w:r>
+      <w:r>
+        <w:rPr>
+          <w:rFonts w:hint="eastAsia"/>
+        </w:rPr>
+        <w:t>横置代表牌失效时的状态。</w:t>
+      </w:r>
+      <w:r>
+        <w:rPr>
+          <w:rFonts w:hint="eastAsia"/>
+        </w:rPr>
+        <w:t>楼层区</w:t>
+      </w:r>
+      <w:r>
+        <w:rPr>
+          <w:rFonts w:hint="eastAsia"/>
+        </w:rPr>
+        <w:t>的牌横置时，视为1张点数为1的无效果牌，其牌名</w:t>
+      </w:r>
+      <w:r>
+        <w:rPr>
+          <w:rFonts w:hint="eastAsia"/>
+        </w:rPr>
+        <w:t>、类型和标签</w:t>
+      </w:r>
+      <w:r>
+        <w:rPr>
+          <w:rFonts w:hint="eastAsia"/>
+        </w:rPr>
+        <w:t>仍保持不变，在回合结束时将其复位。</w:t>
+      </w:r>
+    </w:p>
+    <w:p>
+      <w:pPr>
+        <w:pStyle w:val="3"/>
+        <w:rPr>
+          <w:rFonts w:hint="eastAsia"/>
+        </w:rPr>
+      </w:pPr>
+      <w:r>
+        <w:rPr>
+          <w:rFonts w:hint="eastAsia"/>
+        </w:rPr>
+        <w:t>用语：</w:t>
+      </w:r>
+      <w:r>
+        <w:rPr>
+          <w:rFonts w:hint="eastAsia"/>
+        </w:rPr>
+        <w:t>敌友方</w:t>
+      </w:r>
+    </w:p>
+    <w:p>
+      <w:pPr>
+        <w:rPr>
+          <w:rFonts w:hint="eastAsia"/>
+        </w:rPr>
+      </w:pPr>
+      <w:r>
+        <w:tab/>
+      </w:r>
+      <w:r>
+        <w:rPr>
+          <w:rFonts w:hint="eastAsia"/>
+        </w:rPr>
+        <w:t>阵营不同的牌彼此是敌方；阵营相同的牌彼此是友方。</w:t>
+      </w:r>
+    </w:p>
+    <w:p>
+      <w:pPr>
+        <w:pStyle w:val="3"/>
+        <w:rPr>
+          <w:rFonts w:hint="eastAsia"/>
+        </w:rPr>
+      </w:pPr>
+      <w:r>
+        <w:rPr>
+          <w:rFonts w:hint="eastAsia"/>
+        </w:rPr>
+        <w:t>用语：领域</w:t>
+      </w:r>
+    </w:p>
+    <w:p>
+      <w:pPr>
+        <w:rPr>
+          <w:rFonts w:hint="eastAsia"/>
+        </w:rPr>
+      </w:pPr>
+      <w:r>
+        <w:tab/>
+      </w:r>
+      <w:r>
+        <w:rPr>
+          <w:rFonts w:hint="eastAsia"/>
+        </w:rPr>
+        <w:t>仅用于场地牌的效果文本中。场地牌在奖励区时，其所在奖励位对应的行或列，称为其领域。</w:t>
+      </w:r>
+    </w:p>
+    <w:p>
+      <w:pPr>
+        <w:pStyle w:val="3"/>
+        <w:rPr>
+          <w:rFonts w:hint="eastAsia"/>
+        </w:rPr>
+      </w:pPr>
+      <w:r>
+        <w:rPr>
+          <w:rFonts w:hint="eastAsia"/>
+        </w:rPr>
         <w:lastRenderedPageBreak/>
+        <w:t>用语：</w:t>
+      </w:r>
+      <w:r>
+        <w:rPr>
+          <w:rFonts w:hint="eastAsia"/>
+        </w:rPr>
+        <w:t>送墓/</w:t>
+      </w:r>
+      <w:r>
+        <w:rPr>
+          <w:rFonts w:hint="eastAsia"/>
+        </w:rPr>
+        <w:t>消灭/死亡</w:t>
+      </w:r>
+      <w:r>
+        <w:rPr>
+          <w:rFonts w:hint="eastAsia"/>
+        </w:rPr>
+        <w:t xml:space="preserve"> </w:t>
+      </w:r>
+    </w:p>
+    <w:p>
+      <w:pPr>
+        <w:rPr>
+          <w:rFonts w:hint="eastAsia"/>
+        </w:rPr>
+      </w:pPr>
+      <w:r>
         <w:tab/>
       </w:r>
       <w:r>
         <w:rPr>
           <w:rFonts w:hint="eastAsia"/>
         </w:rPr>
-        <w:t>牌通过移动进入一个房间，称为移入，反之称为移出。玩家出牌、牌堆发牌不</w:t>
-      </w:r>
-      <w:r>
-        <w:rPr>
-          <w:rFonts w:hint="eastAsia"/>
-        </w:rPr>
-        <w:t>视为</w:t>
-      </w:r>
-      <w:r>
-        <w:rPr>
-          <w:rFonts w:hint="eastAsia"/>
-        </w:rPr>
-        <w:t>移入移出。</w:t>
+        <w:t>主牌堆的牌从</w:t>
+      </w:r>
+      <w:r>
+        <w:rPr>
+          <w:rFonts w:hint="eastAsia"/>
+        </w:rPr>
+        <w:t>楼层区</w:t>
+      </w:r>
+      <w:r>
+        <w:rPr>
+          <w:rFonts w:hint="eastAsia"/>
+        </w:rPr>
+        <w:t>送去墓地，称</w:t>
+      </w:r>
+      <w:r>
+        <w:rPr>
+          <w:rFonts w:hint="eastAsia"/>
+        </w:rPr>
+        <w:t>为</w:t>
+      </w:r>
+      <w:r>
+        <w:rPr>
+          <w:rFonts w:hint="eastAsia"/>
+        </w:rPr>
+        <w:t>那张牌死亡</w:t>
+      </w:r>
+      <w:r>
+        <w:rPr>
+          <w:rFonts w:hint="eastAsia"/>
+        </w:rPr>
+        <w:t>；使一张牌死亡，称为消灭一张牌；</w:t>
+      </w:r>
+      <w:r>
+        <w:rPr>
+          <w:rFonts w:hint="eastAsia"/>
+        </w:rPr>
+        <w:t>一张牌A的效果导致另一张牌B死亡时，称为A消灭了B</w:t>
+      </w:r>
+      <w:r>
+        <w:rPr>
+          <w:rFonts w:hint="eastAsia"/>
+        </w:rPr>
+        <w:t>。部分牌的效果也能将牌从其他地方送去墓地，</w:t>
+      </w:r>
+      <w:r>
+        <w:rPr>
+          <w:rFonts w:hint="eastAsia"/>
+        </w:rPr>
+        <w:t>称为送墓</w:t>
+      </w:r>
+      <w:r>
+        <w:rPr>
+          <w:rFonts w:hint="eastAsia"/>
+        </w:rPr>
+        <w:t>，</w:t>
+      </w:r>
+      <w:r>
+        <w:rPr>
+          <w:rFonts w:hint="eastAsia"/>
+        </w:rPr>
+        <w:t>如无</w:t>
+      </w:r>
+      <w:r>
+        <w:rPr>
+          <w:rFonts w:hint="eastAsia"/>
+        </w:rPr>
+        <w:t>特别说明，</w:t>
+      </w:r>
+      <w:r>
+        <w:rPr>
+          <w:rFonts w:hint="eastAsia"/>
+        </w:rPr>
+        <w:t>送墓</w:t>
+      </w:r>
+      <w:r>
+        <w:rPr>
+          <w:rFonts w:hint="eastAsia"/>
+        </w:rPr>
+        <w:t>不视为</w:t>
+      </w:r>
+      <w:r>
+        <w:rPr>
+          <w:rFonts w:hint="eastAsia"/>
+        </w:rPr>
+        <w:t>消灭和</w:t>
+      </w:r>
+      <w:r>
+        <w:rPr>
+          <w:rFonts w:hint="eastAsia"/>
+        </w:rPr>
+        <w:t>死亡。</w:t>
+      </w:r>
+    </w:p>
+    <w:p>
+      <w:pPr>
+        <w:rPr>
+          <w:rFonts w:hint="eastAsia"/>
+        </w:rPr>
+      </w:pPr>
+      <w:r>
+        <w:tab/>
+      </w:r>
+      <w:r>
+        <w:rPr>
+          <w:rFonts w:hint="eastAsia"/>
+        </w:rPr>
+        <w:t>楼层区</w:t>
+      </w:r>
+      <w:r>
+        <w:rPr>
+          <w:rFonts w:hint="eastAsia"/>
+        </w:rPr>
+        <w:t>的牌点数变为0时</w:t>
+      </w:r>
+      <w:r>
+        <w:rPr>
+          <w:rFonts w:hint="eastAsia"/>
+        </w:rPr>
+        <w:t>即死亡</w:t>
+      </w:r>
+      <w:r>
+        <w:rPr>
+          <w:rFonts w:hint="eastAsia"/>
+        </w:rPr>
+        <w:t>，</w:t>
+      </w:r>
+      <w:r>
+        <w:rPr>
+          <w:rFonts w:hint="eastAsia"/>
+        </w:rPr>
+        <w:t>如果此时其他效果正在结算，则将牌死亡的结算</w:t>
+      </w:r>
+      <w:r>
+        <w:rPr>
+          <w:rFonts w:hint="eastAsia"/>
+        </w:rPr>
+        <w:t>插入结算队列</w:t>
+      </w:r>
+      <w:r>
+        <w:rPr>
+          <w:rStyle w:val="af0"/>
+          <w:rFonts w:hint="eastAsia"/>
+        </w:rPr>
+        <w:footnoteReference w:id="6"/>
+      </w:r>
+      <w:r>
+        <w:rPr>
+          <w:rFonts w:hint="eastAsia"/>
+        </w:rPr>
+        <w:t>中</w:t>
+      </w:r>
+      <w:r>
+        <w:rPr>
+          <w:rFonts w:hint="eastAsia"/>
+        </w:rPr>
+        <w:t>。</w:t>
       </w:r>
     </w:p>
     <w:p>
@@ -6061,7 +6779,7 @@
         <w:rPr>
           <w:rFonts w:hint="eastAsia"/>
         </w:rPr>
-        <w:t>用语：交换</w:t>
+        <w:t>用语：免死</w:t>
       </w:r>
     </w:p>
     <w:p>
@@ -6077,19 +6795,31 @@
         <w:rPr>
           <w:rFonts w:hint="eastAsia"/>
         </w:rPr>
-        <w:t>游戏中部分效果可以</w:t>
-      </w:r>
-      <w:r>
-        <w:rPr>
-          <w:rFonts w:hint="eastAsia"/>
-        </w:rPr>
-        <w:t>将两张牌</w:t>
-      </w:r>
-      <w:r>
-        <w:rPr>
-          <w:rFonts w:hint="eastAsia"/>
-        </w:rPr>
-        <w:t>的位置交换，牌的交换也视作移动，交换双方均有一次移入和一次移出，会触发相应的效果。</w:t>
+        <w:t>一张牌本应死亡时，免死可以使其不送去墓地，有其他追加表述</w:t>
+      </w:r>
+      <w:r>
+        <w:rPr>
+          <w:rFonts w:hint="eastAsia"/>
+        </w:rPr>
+        <w:t>时</w:t>
+      </w:r>
+      <w:r>
+        <w:rPr>
+          <w:rFonts w:hint="eastAsia"/>
+        </w:rPr>
+        <w:t>免死的牌留在其原</w:t>
+      </w:r>
+      <w:r>
+        <w:rPr>
+          <w:rFonts w:hint="eastAsia"/>
+        </w:rPr>
+        <w:t>本</w:t>
+      </w:r>
+      <w:r>
+        <w:rPr>
+          <w:rFonts w:hint="eastAsia"/>
+        </w:rPr>
+        <w:t>的位置。</w:t>
       </w:r>
     </w:p>
     <w:p>
@@ -6103,7 +6833,13 @@
         <w:rPr>
           <w:rFonts w:hint="eastAsia"/>
         </w:rPr>
-        <w:t>用语：一半</w:t>
+        <w:t>用语：</w:t>
+      </w:r>
+      <w:r>
+        <w:rPr>
+          <w:rFonts w:hint="eastAsia"/>
+        </w:rPr>
+        <w:t>抽牌</w:t>
       </w:r>
     </w:p>
     <w:p>
@@ -6119,13 +6855,7 @@
         <w:rPr>
           <w:rFonts w:hint="eastAsia"/>
         </w:rPr>
-        <w:t>本游戏中，</w:t>
-      </w:r>
-      <w:r>
-        <w:rPr>
-          <w:rFonts w:hint="eastAsia"/>
-        </w:rPr>
-        <w:t>奇数的一半默认情况下向上取整。</w:t>
+        <w:t>没有限定来源的情况下，抽牌指从主牌堆将牌加入手牌。</w:t>
       </w:r>
     </w:p>
     <w:p>
@@ -6145,13 +6875,7 @@
         <w:rPr>
           <w:rFonts w:hint="eastAsia"/>
         </w:rPr>
-        <w:t>翻</w:t>
-      </w:r>
-      <w:r>
-        <w:rPr>
-          <w:rFonts w:hint="eastAsia"/>
-        </w:rPr>
-        <w:t>选</w:t>
+        <w:t>受玩家控制</w:t>
       </w:r>
     </w:p>
     <w:p>
@@ -6167,25 +6891,265 @@
         <w:rPr>
           <w:rFonts w:hint="eastAsia"/>
         </w:rPr>
-        <w:t>指从牌堆中翻开</w:t>
-      </w:r>
-      <w:r>
-        <w:rPr>
-          <w:rFonts w:hint="eastAsia"/>
-        </w:rPr>
-        <w:t>数</w:t>
-      </w:r>
-      <w:r>
-        <w:rPr>
-          <w:rFonts w:hint="eastAsia"/>
-        </w:rPr>
-        <w:t>张牌</w:t>
-      </w:r>
-      <w:r>
-        <w:rPr>
-          <w:rFonts w:hint="eastAsia"/>
-        </w:rPr>
-        <w:t>后</w:t>
+        <w:t>玩家手牌区和</w:t>
+      </w:r>
+      <w:r>
+        <w:rPr>
+          <w:rFonts w:hint="eastAsia"/>
+        </w:rPr>
+        <w:t>楼层区</w:t>
+      </w:r>
+      <w:r>
+        <w:rPr>
+          <w:rFonts w:hint="eastAsia"/>
+        </w:rPr>
+        <w:t>玩家</w:t>
+      </w:r>
+      <w:r>
+        <w:rPr>
+          <w:rFonts w:hint="eastAsia"/>
+        </w:rPr>
+        <w:t>阵营</w:t>
+      </w:r>
+      <w:r>
+        <w:rPr>
+          <w:rFonts w:hint="eastAsia"/>
+        </w:rPr>
+        <w:t>的牌</w:t>
+      </w:r>
+      <w:r>
+        <w:rPr>
+          <w:rFonts w:hint="eastAsia"/>
+        </w:rPr>
+        <w:t>视作受玩家</w:t>
+      </w:r>
+      <w:r>
+        <w:rPr>
+          <w:rFonts w:hint="eastAsia"/>
+        </w:rPr>
+        <w:t>控制</w:t>
+      </w:r>
+      <w:r>
+        <w:rPr>
+          <w:rFonts w:hint="eastAsia"/>
+        </w:rPr>
+        <w:t>。</w:t>
+      </w:r>
+    </w:p>
+    <w:p>
+      <w:pPr>
+        <w:pStyle w:val="3"/>
+        <w:rPr>
+          <w:rFonts w:hint="eastAsia"/>
+        </w:rPr>
+      </w:pPr>
+      <w:r>
+        <w:rPr>
+          <w:rFonts w:hint="eastAsia"/>
+        </w:rPr>
+        <w:t>用语：出售</w:t>
+      </w:r>
+    </w:p>
+    <w:p>
+      <w:pPr>
+        <w:rPr>
+          <w:rFonts w:hint="eastAsia"/>
+        </w:rPr>
+      </w:pPr>
+      <w:r>
+        <w:tab/>
+      </w:r>
+      <w:r>
+        <w:rPr>
+          <w:rFonts w:hint="eastAsia"/>
+        </w:rPr>
+        <w:t>《商店》牌的效果允许玩家出售</w:t>
+      </w:r>
+      <w:r>
+        <w:rPr>
+          <w:rFonts w:hint="eastAsia"/>
+        </w:rPr>
+        <w:t>背包区的</w:t>
+      </w:r>
+      <w:r>
+        <w:rPr>
+          <w:rFonts w:hint="eastAsia"/>
+        </w:rPr>
+        <w:t>牌</w:t>
+      </w:r>
+      <w:r>
+        <w:rPr>
+          <w:rFonts w:hint="eastAsia"/>
+        </w:rPr>
+        <w:t>以换取金币。</w:t>
+      </w:r>
+      <w:r>
+        <w:rPr>
+          <w:rFonts w:hint="eastAsia"/>
+        </w:rPr>
+        <w:t>出售是特殊的弃置，除了触发出售时发动的效果外，也触发弃置时发动的效果。</w:t>
+      </w:r>
+    </w:p>
+    <w:p>
+      <w:pPr>
+        <w:pStyle w:val="3"/>
+        <w:rPr>
+          <w:rFonts w:hint="eastAsia"/>
+        </w:rPr>
+      </w:pPr>
+      <w:r>
+        <w:rPr>
+          <w:rFonts w:hint="eastAsia"/>
+        </w:rPr>
+        <w:t>用语：被弃置时</w:t>
+      </w:r>
+    </w:p>
+    <w:p>
+      <w:pPr>
+        <w:rPr>
+          <w:rFonts w:hint="eastAsia"/>
+        </w:rPr>
+      </w:pPr>
+      <w:r>
+        <w:tab/>
+      </w:r>
+      <w:r>
+        <w:rPr>
+          <w:rFonts w:hint="eastAsia"/>
+        </w:rPr>
+        <w:t>如无定语，则包含从任意地点被弃置到弃牌堆的情况，包括且不限于从战场、手牌、</w:t>
+      </w:r>
+      <w:r>
+        <w:rPr>
+          <w:rFonts w:hint="eastAsia"/>
+        </w:rPr>
+        <w:t>楼层区</w:t>
+      </w:r>
+      <w:r>
+        <w:rPr>
+          <w:rFonts w:hint="eastAsia"/>
+        </w:rPr>
+        <w:t>、主牌堆、弃牌堆等。</w:t>
+      </w:r>
+    </w:p>
+    <w:p>
+      <w:pPr>
+        <w:pStyle w:val="3"/>
+        <w:rPr>
+          <w:rFonts w:hint="eastAsia"/>
+        </w:rPr>
+      </w:pPr>
+      <w:r>
+        <w:rPr>
+          <w:rFonts w:hint="eastAsia"/>
+        </w:rPr>
+        <w:t>效果中止</w:t>
+      </w:r>
+    </w:p>
+    <w:p>
+      <w:pPr>
+        <w:rPr>
+          <w:rFonts w:hint="eastAsia"/>
+        </w:rPr>
+      </w:pPr>
+      <w:r>
+        <w:tab/>
+      </w:r>
+      <w:r>
+        <w:rPr>
+          <w:rFonts w:hint="eastAsia"/>
+        </w:rPr>
+        <w:t>效果处理途中</w:t>
+      </w:r>
+      <w:r>
+        <w:rPr>
+          <w:rFonts w:hint="eastAsia"/>
+        </w:rPr>
+        <w:t>遇到</w:t>
+      </w:r>
+      <w:r>
+        <w:rPr>
+          <w:rFonts w:hint="eastAsia"/>
+        </w:rPr>
+        <w:t>无法继续处理</w:t>
+      </w:r>
+      <w:r>
+        <w:rPr>
+          <w:rFonts w:hint="eastAsia"/>
+        </w:rPr>
+        <w:t>的情况</w:t>
+      </w:r>
+      <w:r>
+        <w:rPr>
+          <w:rFonts w:hint="eastAsia"/>
+        </w:rPr>
+        <w:t>时，</w:t>
+      </w:r>
+      <w:r>
+        <w:rPr>
+          <w:rFonts w:hint="eastAsia"/>
+        </w:rPr>
+        <w:t>将同一句话中</w:t>
+      </w:r>
+      <w:r>
+        <w:rPr>
+          <w:rFonts w:hint="eastAsia"/>
+        </w:rPr>
+        <w:t>的后续</w:t>
+      </w:r>
+      <w:r>
+        <w:rPr>
+          <w:rFonts w:hint="eastAsia"/>
+        </w:rPr>
+        <w:t>处理</w:t>
+      </w:r>
+      <w:r>
+        <w:rPr>
+          <w:rFonts w:hint="eastAsia"/>
+        </w:rPr>
+        <w:t>全部跳过</w:t>
+      </w:r>
+      <w:r>
+        <w:rPr>
+          <w:rFonts w:hint="eastAsia"/>
+        </w:rPr>
+        <w:t>，从下一句开始继续处理</w:t>
+      </w:r>
+      <w:r>
+        <w:rPr>
+          <w:rFonts w:hint="eastAsia"/>
+        </w:rPr>
+        <w:t>。例如，</w:t>
+      </w:r>
+      <w:r>
+        <w:rPr>
+          <w:rFonts w:hint="eastAsia"/>
+        </w:rPr>
+        <w:t>一个效果</w:t>
+      </w:r>
+      <w:r>
+        <w:rPr>
+          <w:rFonts w:hint="eastAsia"/>
+        </w:rPr>
+        <w:t>要求玩家</w:t>
+      </w:r>
+      <w:r>
+        <w:rPr>
+          <w:rFonts w:hint="eastAsia"/>
+        </w:rPr>
+        <w:t>“</w:t>
+      </w:r>
+      <w:r>
+        <w:rPr>
+          <w:rFonts w:hint="eastAsia"/>
+        </w:rPr>
+        <w:t>从主牌堆抽1张牌，再将1张手牌放回主牌堆</w:t>
+      </w:r>
+      <w:r>
+        <w:rPr>
+          <w:rFonts w:hint="eastAsia"/>
+        </w:rPr>
+        <w:t>。然后受到1伤害”</w:t>
       </w:r>
       <w:r>
         <w:rPr>
@@ -6197,19 +7161,19 @@
         <w:rPr>
           <w:rFonts w:hint="eastAsia"/>
         </w:rPr>
-        <w:t>再</w:t>
-      </w:r>
-      <w:r>
-        <w:rPr>
-          <w:rFonts w:hint="eastAsia"/>
-        </w:rPr>
-        <w:t>选</w:t>
-      </w:r>
-      <w:r>
-        <w:rPr>
-          <w:rFonts w:hint="eastAsia"/>
-        </w:rPr>
-        <w:t>其中的某几张</w:t>
+        <w:t>如果该效果发动时，</w:t>
+      </w:r>
+      <w:r>
+        <w:rPr>
+          <w:rFonts w:hint="eastAsia"/>
+        </w:rPr>
+        <w:t>主牌堆已经没有牌了，则玩家既不能从主牌堆抽牌，也不需要将手牌放回主牌堆</w:t>
+      </w:r>
+      <w:r>
+        <w:rPr>
+          <w:rFonts w:hint="eastAsia"/>
+        </w:rPr>
+        <w:t>，但是仍会受到1伤害</w:t>
       </w:r>
       <w:r>
         <w:rPr>
@@ -6217,59 +7181,20 @@
         </w:rPr>
         <w:t>。</w:t>
       </w:r>
-      <w:r>
-        <w:rPr>
-          <w:rFonts w:hint="eastAsia"/>
-        </w:rPr>
-        <w:t>当</w:t>
-      </w:r>
-      <w:r>
-        <w:rPr>
-          <w:rFonts w:hint="eastAsia"/>
-        </w:rPr>
-        <w:t>规则或效果文本要求玩家从某个牌堆</w:t>
-      </w:r>
-      <w:r>
-        <w:rPr>
-          <w:rFonts w:hint="eastAsia"/>
-        </w:rPr>
-        <w:t>翻</w:t>
-      </w:r>
-      <w:r>
-        <w:rPr>
-          <w:rFonts w:hint="eastAsia"/>
-        </w:rPr>
-        <w:t>选</w:t>
-      </w:r>
-      <w:r>
-        <w:rPr>
-          <w:rFonts w:hint="eastAsia"/>
-        </w:rPr>
-        <w:t>时，如果没有额外的</w:t>
-      </w:r>
-      <w:r>
-        <w:rPr>
-          <w:rFonts w:hint="eastAsia"/>
-        </w:rPr>
-        <w:t>说明，</w:t>
-      </w:r>
-      <w:r>
-        <w:rPr>
-          <w:rFonts w:hint="eastAsia"/>
-        </w:rPr>
-        <w:t>没有被选中的牌</w:t>
-      </w:r>
-      <w:r>
-        <w:rPr>
-          <w:rFonts w:hint="eastAsia"/>
-        </w:rPr>
-        <w:t>洗回原牌堆</w:t>
-      </w:r>
-      <w:r>
-        <w:rPr>
-          <w:rFonts w:hint="eastAsia"/>
-        </w:rPr>
-        <w:t>。</w:t>
+    </w:p>
+    <w:p>
+      <w:pPr>
+        <w:pStyle w:val="3"/>
+        <w:rPr>
+          <w:rFonts w:hint="eastAsia"/>
+        </w:rPr>
+      </w:pPr>
+      <w:r>
+        <w:rPr>
+          <w:rFonts w:hint="eastAsia"/>
+        </w:rPr>
+        <w:lastRenderedPageBreak/>
+        <w:t>效果自指</w:t>
       </w:r>
     </w:p>
     <w:p>
@@ -6285,31 +7210,25 @@
         <w:rPr>
           <w:rFonts w:hint="eastAsia"/>
         </w:rPr>
-        <w:t>没有特别说明的情况下，玩家翻开牌后，可以消耗金币，重抽其中任意张牌，称为重翻。没有特别说明的情况下，每次翻选的第一次重翻消耗</w:t>
-      </w:r>
-      <w:r>
-        <w:rPr>
-          <w:rFonts w:hint="eastAsia"/>
-        </w:rPr>
-        <w:t>2</w:t>
-      </w:r>
-      <w:r>
-        <w:rPr>
-          <w:rFonts w:hint="eastAsia"/>
-        </w:rPr>
-        <w:t>金币，之后每多进行</w:t>
-      </w:r>
-      <w:r>
-        <w:rPr>
-          <w:rFonts w:hint="eastAsia"/>
-        </w:rPr>
-        <w:t>一</w:t>
-      </w:r>
-      <w:r>
-        <w:rPr>
-          <w:rFonts w:hint="eastAsia"/>
-        </w:rPr>
-        <w:t>次重翻，消耗金币加1。</w:t>
+        <w:t>没有特别说明的情况下，牌效果的目标</w:t>
+      </w:r>
+      <w:r>
+        <w:rPr>
+          <w:rFonts w:hint="eastAsia"/>
+        </w:rPr>
+        <w:t>可以</w:t>
+      </w:r>
+      <w:r>
+        <w:rPr>
+          <w:rFonts w:hint="eastAsia"/>
+        </w:rPr>
+        <w:t>包含自身，例如目标为“本牌所在房间所有牌”的效果，</w:t>
+      </w:r>
+      <w:r>
+        <w:rPr>
+          <w:rFonts w:hint="eastAsia"/>
+        </w:rPr>
+        <w:t>目标中也包含发动该效果的牌。</w:t>
       </w:r>
     </w:p>
     <w:p>
@@ -6323,7 +7242,7 @@
         <w:rPr>
           <w:rFonts w:hint="eastAsia"/>
         </w:rPr>
-        <w:t>用语：横置</w:t>
+        <w:t>结算队列</w:t>
       </w:r>
     </w:p>
     <w:p>
@@ -6339,193 +7258,37 @@
         <w:rPr>
           <w:rFonts w:hint="eastAsia"/>
         </w:rPr>
-        <w:t>横置代表牌失效时的状态。</w:t>
-      </w:r>
-      <w:r>
-        <w:rPr>
-          <w:rFonts w:hint="eastAsia"/>
-        </w:rPr>
-        <w:t>楼层区</w:t>
-      </w:r>
-      <w:r>
-        <w:rPr>
-          <w:rFonts w:hint="eastAsia"/>
-        </w:rPr>
-        <w:t>的牌横置时，视为1张点数为1的无效果牌，其牌名</w:t>
-      </w:r>
-      <w:r>
-        <w:rPr>
-          <w:rFonts w:hint="eastAsia"/>
-        </w:rPr>
-        <w:t>、类型和标签</w:t>
-      </w:r>
-      <w:r>
-        <w:rPr>
-          <w:rFonts w:hint="eastAsia"/>
-        </w:rPr>
-        <w:t>仍保持不变，在回合结束时将其复位。</w:t>
-      </w:r>
-    </w:p>
-    <w:p>
-      <w:pPr>
-        <w:pStyle w:val="3"/>
-        <w:rPr>
-          <w:rFonts w:hint="eastAsia"/>
-        </w:rPr>
-      </w:pPr>
-      <w:r>
-        <w:rPr>
-          <w:rFonts w:hint="eastAsia"/>
-        </w:rPr>
-        <w:t>用语：</w:t>
-      </w:r>
-      <w:r>
-        <w:rPr>
-          <w:rFonts w:hint="eastAsia"/>
-        </w:rPr>
-        <w:t>敌友方</w:t>
-      </w:r>
-    </w:p>
-    <w:p>
-      <w:pPr>
-        <w:rPr>
-          <w:rFonts w:hint="eastAsia"/>
-        </w:rPr>
-      </w:pPr>
-      <w:r>
-        <w:tab/>
-      </w:r>
-      <w:r>
-        <w:rPr>
-          <w:rFonts w:hint="eastAsia"/>
-        </w:rPr>
-        <w:t>阵营不同的牌彼此是敌方；阵营相同的牌彼此是友方。</w:t>
-      </w:r>
-    </w:p>
-    <w:p>
-      <w:pPr>
-        <w:pStyle w:val="3"/>
-        <w:rPr>
-          <w:rFonts w:hint="eastAsia"/>
-        </w:rPr>
-      </w:pPr>
-      <w:r>
-        <w:rPr>
-          <w:rFonts w:hint="eastAsia"/>
-        </w:rPr>
-        <w:t>用语：领域</w:t>
-      </w:r>
-    </w:p>
-    <w:p>
-      <w:pPr>
-        <w:rPr>
-          <w:rFonts w:hint="eastAsia"/>
-        </w:rPr>
-      </w:pPr>
-      <w:r>
-        <w:tab/>
-      </w:r>
-      <w:r>
-        <w:rPr>
-          <w:rFonts w:hint="eastAsia"/>
-        </w:rPr>
-        <w:t>仅用于场地牌的效果文本中。场地牌在奖励区时，其所在奖励位对应的行或列，称为其领域。</w:t>
-      </w:r>
-    </w:p>
-    <w:p>
-      <w:pPr>
-        <w:pStyle w:val="3"/>
-        <w:rPr>
-          <w:rFonts w:hint="eastAsia"/>
-        </w:rPr>
-      </w:pPr>
-      <w:r>
-        <w:rPr>
-          <w:rFonts w:hint="eastAsia"/>
-        </w:rPr>
-        <w:t>用语：</w:t>
-      </w:r>
-      <w:r>
-        <w:rPr>
-          <w:rFonts w:hint="eastAsia"/>
-        </w:rPr>
-        <w:t>送墓/</w:t>
-      </w:r>
-      <w:r>
-        <w:rPr>
-          <w:rFonts w:hint="eastAsia"/>
-        </w:rPr>
-        <w:t>消灭/死亡</w:t>
-      </w:r>
-      <w:r>
-        <w:rPr>
-          <w:rFonts w:hint="eastAsia"/>
-        </w:rPr>
-        <w:t xml:space="preserve"> </w:t>
-      </w:r>
-    </w:p>
-    <w:p>
-      <w:pPr>
-        <w:rPr>
-          <w:rFonts w:hint="eastAsia"/>
-        </w:rPr>
-      </w:pPr>
-      <w:r>
-        <w:tab/>
-      </w:r>
-      <w:r>
-        <w:rPr>
-          <w:rFonts w:hint="eastAsia"/>
-        </w:rPr>
-        <w:t>主牌堆的牌从</w:t>
-      </w:r>
-      <w:r>
-        <w:rPr>
-          <w:rFonts w:hint="eastAsia"/>
-        </w:rPr>
-        <w:t>楼层区</w:t>
-      </w:r>
-      <w:r>
-        <w:rPr>
-          <w:rFonts w:hint="eastAsia"/>
-        </w:rPr>
-        <w:t>送去墓地，称</w:t>
-      </w:r>
-      <w:r>
-        <w:rPr>
-          <w:rFonts w:hint="eastAsia"/>
-        </w:rPr>
-        <w:t>为</w:t>
-      </w:r>
-      <w:r>
-        <w:rPr>
-          <w:rFonts w:hint="eastAsia"/>
-        </w:rPr>
-        <w:t>那张牌死亡</w:t>
-      </w:r>
-      <w:r>
-        <w:rPr>
-          <w:rFonts w:hint="eastAsia"/>
-        </w:rPr>
-        <w:t>；使一张牌死亡，称为消灭一张牌；</w:t>
-      </w:r>
-      <w:r>
-        <w:rPr>
-          <w:rFonts w:hint="eastAsia"/>
-        </w:rPr>
-        <w:t>一张牌A的效果导致另一张牌B死亡时，称为A消灭了B</w:t>
-      </w:r>
-      <w:r>
-        <w:rPr>
-          <w:rFonts w:hint="eastAsia"/>
-        </w:rPr>
-        <w:t>。部分牌的效果也能将牌从其他地方送去墓地，</w:t>
-      </w:r>
-      <w:r>
-        <w:rPr>
-          <w:rFonts w:hint="eastAsia"/>
-        </w:rPr>
-        <w:t>称为送墓</w:t>
+        <w:t>一个效果执行中时，如果满足了其他</w:t>
+      </w:r>
+      <w:r>
+        <w:rPr>
+          <w:rFonts w:hint="eastAsia"/>
+        </w:rPr>
+        <w:t>牌的</w:t>
+      </w:r>
+      <w:r>
+        <w:rPr>
+          <w:rFonts w:hint="eastAsia"/>
+        </w:rPr>
+        <w:t>效果的触发条件，</w:t>
+      </w:r>
+      <w:r>
+        <w:rPr>
+          <w:rFonts w:hint="eastAsia"/>
+        </w:rPr>
+        <w:t>则</w:t>
+      </w:r>
+      <w:r>
+        <w:rPr>
+          <w:rFonts w:hint="eastAsia"/>
+        </w:rPr>
+        <w:t>将其记录</w:t>
+      </w:r>
+      <w:r>
+        <w:rPr>
+          <w:rFonts w:hint="eastAsia"/>
+        </w:rPr>
+        <w:t>到队列中</w:t>
       </w:r>
       <w:r>
         <w:rPr>
@@ -6537,656 +7300,13 @@
         <w:rPr>
           <w:rFonts w:hint="eastAsia"/>
         </w:rPr>
-        <w:t>如无</w:t>
-      </w:r>
-      <w:r>
-        <w:rPr>
-          <w:rFonts w:hint="eastAsia"/>
-        </w:rPr>
-        <w:t>特别说明，</w:t>
-      </w:r>
-      <w:r>
-        <w:rPr>
-          <w:rFonts w:hint="eastAsia"/>
-        </w:rPr>
-        <w:t>送墓</w:t>
-      </w:r>
-      <w:r>
-        <w:rPr>
-          <w:rFonts w:hint="eastAsia"/>
-        </w:rPr>
-        <w:t>不视为</w:t>
-      </w:r>
-      <w:r>
-        <w:rPr>
-          <w:rFonts w:hint="eastAsia"/>
-        </w:rPr>
-        <w:t>消灭和</w:t>
-      </w:r>
-      <w:r>
-        <w:rPr>
-          <w:rFonts w:hint="eastAsia"/>
-        </w:rPr>
-        <w:t>死亡。</w:t>
-      </w:r>
-    </w:p>
-    <w:p>
-      <w:pPr>
-        <w:rPr>
-          <w:rFonts w:hint="eastAsia"/>
-        </w:rPr>
-      </w:pPr>
-      <w:r>
-        <w:tab/>
-      </w:r>
-      <w:r>
-        <w:rPr>
-          <w:rFonts w:hint="eastAsia"/>
-        </w:rPr>
-        <w:t>楼层区</w:t>
-      </w:r>
-      <w:r>
-        <w:rPr>
-          <w:rFonts w:hint="eastAsia"/>
-        </w:rPr>
-        <w:t>的牌点数变为0时</w:t>
-      </w:r>
-      <w:r>
-        <w:rPr>
-          <w:rFonts w:hint="eastAsia"/>
-        </w:rPr>
-        <w:t>即死亡</w:t>
-      </w:r>
-      <w:r>
-        <w:rPr>
-          <w:rFonts w:hint="eastAsia"/>
-        </w:rPr>
-        <w:t>，</w:t>
-      </w:r>
-      <w:r>
-        <w:rPr>
-          <w:rFonts w:hint="eastAsia"/>
-        </w:rPr>
-        <w:t>如果此时其他效果正在结算，则将牌死亡的结</w:t>
-      </w:r>
-      <w:r>
-        <w:rPr>
-          <w:rFonts w:hint="eastAsia"/>
-        </w:rPr>
-        <w:lastRenderedPageBreak/>
-        <w:t>算</w:t>
-      </w:r>
-      <w:r>
-        <w:rPr>
-          <w:rFonts w:hint="eastAsia"/>
-        </w:rPr>
-        <w:t>插入结算队列</w:t>
-      </w:r>
-      <w:r>
-        <w:rPr>
-          <w:rStyle w:val="af0"/>
-          <w:rFonts w:hint="eastAsia"/>
-        </w:rPr>
-        <w:footnoteReference w:id="6"/>
-      </w:r>
-      <w:r>
-        <w:rPr>
-          <w:rFonts w:hint="eastAsia"/>
-        </w:rPr>
-        <w:t>中</w:t>
-      </w:r>
-      <w:r>
-        <w:rPr>
-          <w:rFonts w:hint="eastAsia"/>
-        </w:rPr>
-        <w:t>。</w:t>
-      </w:r>
-    </w:p>
-    <w:p>
-      <w:pPr>
-        <w:pStyle w:val="3"/>
-        <w:rPr>
-          <w:rFonts w:hint="eastAsia"/>
-        </w:rPr>
-      </w:pPr>
-      <w:r>
-        <w:rPr>
-          <w:rFonts w:hint="eastAsia"/>
-        </w:rPr>
-        <w:t>用语：免死</w:t>
-      </w:r>
-    </w:p>
-    <w:p>
-      <w:pPr>
-        <w:rPr>
-          <w:rFonts w:hint="eastAsia"/>
-        </w:rPr>
-      </w:pPr>
-      <w:r>
-        <w:tab/>
-      </w:r>
-      <w:r>
-        <w:rPr>
-          <w:rFonts w:hint="eastAsia"/>
-        </w:rPr>
-        <w:t>一张牌本应死亡时，免死可以使其不送去墓地，有其他追加表述</w:t>
-      </w:r>
-      <w:r>
-        <w:rPr>
-          <w:rFonts w:hint="eastAsia"/>
-        </w:rPr>
-        <w:t>时</w:t>
-      </w:r>
-      <w:r>
-        <w:rPr>
-          <w:rFonts w:hint="eastAsia"/>
-        </w:rPr>
-        <w:t>免死的牌留在其原</w:t>
-      </w:r>
-      <w:r>
-        <w:rPr>
-          <w:rFonts w:hint="eastAsia"/>
-        </w:rPr>
-        <w:t>本</w:t>
-      </w:r>
-      <w:r>
-        <w:rPr>
-          <w:rFonts w:hint="eastAsia"/>
-        </w:rPr>
-        <w:t>的位置。</w:t>
-      </w:r>
-    </w:p>
-    <w:p>
-      <w:pPr>
-        <w:pStyle w:val="3"/>
-        <w:rPr>
-          <w:rFonts w:hint="eastAsia"/>
-        </w:rPr>
-      </w:pPr>
-      <w:r>
-        <w:rPr>
-          <w:rFonts w:hint="eastAsia"/>
-        </w:rPr>
-        <w:t>用语：</w:t>
-      </w:r>
-      <w:r>
-        <w:rPr>
-          <w:rFonts w:hint="eastAsia"/>
-        </w:rPr>
-        <w:t>抽牌</w:t>
-      </w:r>
-    </w:p>
-    <w:p>
-      <w:pPr>
-        <w:rPr>
-          <w:rFonts w:hint="eastAsia"/>
-        </w:rPr>
-      </w:pPr>
-      <w:r>
-        <w:tab/>
-      </w:r>
-      <w:r>
-        <w:rPr>
-          <w:rFonts w:hint="eastAsia"/>
-        </w:rPr>
-        <w:t>没有限定来源的情况下，抽牌指从主牌堆将牌加入手牌。</w:t>
-      </w:r>
-    </w:p>
-    <w:p>
-      <w:pPr>
-        <w:pStyle w:val="3"/>
-        <w:rPr>
-          <w:rFonts w:hint="eastAsia"/>
-        </w:rPr>
-      </w:pPr>
-      <w:r>
-        <w:rPr>
-          <w:rFonts w:hint="eastAsia"/>
-        </w:rPr>
-        <w:t>用语：</w:t>
-      </w:r>
-      <w:r>
-        <w:rPr>
-          <w:rFonts w:hint="eastAsia"/>
-        </w:rPr>
-        <w:t>受玩家控制</w:t>
-      </w:r>
-    </w:p>
-    <w:p>
-      <w:pPr>
-        <w:rPr>
-          <w:rFonts w:hint="eastAsia"/>
-        </w:rPr>
-      </w:pPr>
-      <w:r>
-        <w:tab/>
-      </w:r>
-      <w:r>
-        <w:rPr>
-          <w:rFonts w:hint="eastAsia"/>
-        </w:rPr>
-        <w:t>玩家手牌区和</w:t>
-      </w:r>
-      <w:r>
-        <w:rPr>
-          <w:rFonts w:hint="eastAsia"/>
-        </w:rPr>
-        <w:t>楼层区</w:t>
-      </w:r>
-      <w:r>
-        <w:rPr>
-          <w:rFonts w:hint="eastAsia"/>
-        </w:rPr>
-        <w:t>玩家</w:t>
-      </w:r>
-      <w:r>
-        <w:rPr>
-          <w:rFonts w:hint="eastAsia"/>
-        </w:rPr>
-        <w:t>阵营</w:t>
-      </w:r>
-      <w:r>
-        <w:rPr>
-          <w:rFonts w:hint="eastAsia"/>
-        </w:rPr>
-        <w:t>的牌</w:t>
-      </w:r>
-      <w:r>
-        <w:rPr>
-          <w:rFonts w:hint="eastAsia"/>
-        </w:rPr>
-        <w:t>视作受玩家</w:t>
-      </w:r>
-      <w:r>
-        <w:rPr>
-          <w:rFonts w:hint="eastAsia"/>
-        </w:rPr>
-        <w:t>控制</w:t>
-      </w:r>
-      <w:r>
-        <w:rPr>
-          <w:rFonts w:hint="eastAsia"/>
-        </w:rPr>
-        <w:t>。</w:t>
-      </w:r>
-    </w:p>
-    <w:p>
-      <w:pPr>
-        <w:pStyle w:val="3"/>
-        <w:rPr>
-          <w:rFonts w:hint="eastAsia"/>
-        </w:rPr>
-      </w:pPr>
-      <w:r>
-        <w:rPr>
-          <w:rFonts w:hint="eastAsia"/>
-        </w:rPr>
-        <w:t>用语：出售</w:t>
-      </w:r>
-    </w:p>
-    <w:p>
-      <w:pPr>
-        <w:rPr>
-          <w:rFonts w:hint="eastAsia"/>
-        </w:rPr>
-      </w:pPr>
-      <w:r>
-        <w:tab/>
-      </w:r>
-      <w:r>
-        <w:rPr>
-          <w:rFonts w:hint="eastAsia"/>
-        </w:rPr>
-        <w:t>《商店》牌的效果允许玩家出售</w:t>
-      </w:r>
-      <w:r>
-        <w:rPr>
-          <w:rFonts w:hint="eastAsia"/>
-        </w:rPr>
-        <w:t>背包区的</w:t>
-      </w:r>
-      <w:r>
-        <w:rPr>
-          <w:rFonts w:hint="eastAsia"/>
-        </w:rPr>
-        <w:t>牌</w:t>
-      </w:r>
-      <w:r>
-        <w:rPr>
-          <w:rFonts w:hint="eastAsia"/>
-        </w:rPr>
-        <w:t>以换取金币。</w:t>
-      </w:r>
-      <w:r>
-        <w:rPr>
-          <w:rFonts w:hint="eastAsia"/>
-        </w:rPr>
-        <w:t>出售是特殊的弃置，除了触发出售时发动的效果外，也触发弃置时发动的效果。</w:t>
-      </w:r>
-    </w:p>
-    <w:p>
-      <w:pPr>
-        <w:pStyle w:val="3"/>
-        <w:rPr>
-          <w:rFonts w:hint="eastAsia"/>
-        </w:rPr>
-      </w:pPr>
-      <w:r>
-        <w:rPr>
-          <w:rFonts w:hint="eastAsia"/>
-        </w:rPr>
-        <w:t>用语：被弃置时</w:t>
-      </w:r>
-    </w:p>
-    <w:p>
-      <w:pPr>
-        <w:rPr>
-          <w:rFonts w:hint="eastAsia"/>
-        </w:rPr>
-      </w:pPr>
-      <w:r>
-        <w:tab/>
-      </w:r>
-      <w:r>
-        <w:rPr>
-          <w:rFonts w:hint="eastAsia"/>
-        </w:rPr>
-        <w:t>如无定语，则包含从任意地点被弃置到弃牌堆的情况，包括且不限于从战场、手牌、</w:t>
-      </w:r>
-      <w:r>
-        <w:rPr>
-          <w:rFonts w:hint="eastAsia"/>
-        </w:rPr>
-        <w:t>楼层区</w:t>
-      </w:r>
-      <w:r>
-        <w:rPr>
-          <w:rFonts w:hint="eastAsia"/>
-        </w:rPr>
-        <w:t>、主牌堆、弃牌堆等。</w:t>
-      </w:r>
-    </w:p>
-    <w:p>
-      <w:pPr>
-        <w:pStyle w:val="3"/>
-        <w:rPr>
-          <w:rFonts w:hint="eastAsia"/>
-        </w:rPr>
-      </w:pPr>
-      <w:r>
-        <w:rPr>
-          <w:rFonts w:hint="eastAsia"/>
-        </w:rPr>
-        <w:t>效果中止</w:t>
-      </w:r>
-    </w:p>
-    <w:p>
-      <w:pPr>
-        <w:rPr>
-          <w:rFonts w:hint="eastAsia"/>
-        </w:rPr>
-      </w:pPr>
-      <w:r>
-        <w:tab/>
-      </w:r>
-      <w:r>
-        <w:rPr>
-          <w:rFonts w:hint="eastAsia"/>
-        </w:rPr>
-        <w:t>效果处理途中</w:t>
-      </w:r>
-      <w:r>
-        <w:rPr>
-          <w:rFonts w:hint="eastAsia"/>
-        </w:rPr>
-        <w:t>遇到</w:t>
-      </w:r>
-      <w:r>
-        <w:rPr>
-          <w:rFonts w:hint="eastAsia"/>
-        </w:rPr>
-        <w:t>无法继续处理</w:t>
-      </w:r>
-      <w:r>
-        <w:rPr>
-          <w:rFonts w:hint="eastAsia"/>
-        </w:rPr>
-        <w:t>的情况</w:t>
-      </w:r>
-      <w:r>
-        <w:rPr>
-          <w:rFonts w:hint="eastAsia"/>
-        </w:rPr>
-        <w:t>时，</w:t>
-      </w:r>
-      <w:r>
-        <w:rPr>
-          <w:rFonts w:hint="eastAsia"/>
-        </w:rPr>
-        <w:t>将同一句话中</w:t>
-      </w:r>
-      <w:r>
-        <w:rPr>
-          <w:rFonts w:hint="eastAsia"/>
-        </w:rPr>
-        <w:t>的后续</w:t>
-      </w:r>
-      <w:r>
-        <w:rPr>
-          <w:rFonts w:hint="eastAsia"/>
-        </w:rPr>
-        <w:t>处理</w:t>
-      </w:r>
-      <w:r>
-        <w:rPr>
-          <w:rFonts w:hint="eastAsia"/>
-        </w:rPr>
-        <w:t>全部跳过</w:t>
-      </w:r>
-      <w:r>
-        <w:rPr>
-          <w:rFonts w:hint="eastAsia"/>
-        </w:rPr>
-        <w:t>，从下一句开始继续处理</w:t>
-      </w:r>
-      <w:r>
-        <w:rPr>
-          <w:rFonts w:hint="eastAsia"/>
-        </w:rPr>
-        <w:t>。例如，</w:t>
-      </w:r>
-      <w:r>
-        <w:rPr>
-          <w:rFonts w:hint="eastAsia"/>
-        </w:rPr>
-        <w:t>一个效果</w:t>
-      </w:r>
-      <w:r>
-        <w:rPr>
-          <w:rFonts w:hint="eastAsia"/>
-        </w:rPr>
-        <w:t>要求玩家</w:t>
-      </w:r>
-      <w:r>
-        <w:rPr>
-          <w:rFonts w:hint="eastAsia"/>
-        </w:rPr>
-        <w:t>“</w:t>
-      </w:r>
-      <w:r>
-        <w:rPr>
-          <w:rFonts w:hint="eastAsia"/>
-        </w:rPr>
-        <w:t>从主牌堆抽1张牌，再将1张手牌放回主牌堆</w:t>
-      </w:r>
-      <w:r>
-        <w:rPr>
-          <w:rFonts w:hint="eastAsia"/>
-        </w:rPr>
-        <w:t>。然后受到1伤害”</w:t>
-      </w:r>
-      <w:r>
-        <w:rPr>
-          <w:rFonts w:hint="eastAsia"/>
-        </w:rPr>
-        <w:t>，</w:t>
-      </w:r>
-      <w:r>
-        <w:rPr>
-          <w:rFonts w:hint="eastAsia"/>
-        </w:rPr>
-        <w:t>如果该效果发动时，</w:t>
-      </w:r>
-      <w:r>
-        <w:rPr>
-          <w:rFonts w:hint="eastAsia"/>
-        </w:rPr>
-        <w:t>主牌堆已经没有牌了，则玩家既不能从主牌堆抽牌，也不需要将手牌放回主牌堆</w:t>
-      </w:r>
-      <w:r>
-        <w:rPr>
-          <w:rFonts w:hint="eastAsia"/>
-        </w:rPr>
-        <w:t>，但是仍会受到1伤害</w:t>
-      </w:r>
-      <w:r>
-        <w:rPr>
-          <w:rFonts w:hint="eastAsia"/>
-        </w:rPr>
-        <w:t>。</w:t>
-      </w:r>
-    </w:p>
-    <w:p>
-      <w:pPr>
-        <w:pStyle w:val="3"/>
-        <w:rPr>
-          <w:rFonts w:hint="eastAsia"/>
-        </w:rPr>
-      </w:pPr>
-      <w:r>
-        <w:rPr>
-          <w:rFonts w:hint="eastAsia"/>
-        </w:rPr>
-        <w:t>效果自指</w:t>
-      </w:r>
-    </w:p>
-    <w:p>
-      <w:pPr>
-        <w:rPr>
-          <w:rFonts w:hint="eastAsia"/>
-        </w:rPr>
-      </w:pPr>
-      <w:r>
-        <w:tab/>
-      </w:r>
-      <w:r>
-        <w:rPr>
-          <w:rFonts w:hint="eastAsia"/>
-        </w:rPr>
-        <w:t>没有特别说明的情况下，牌效果的目标</w:t>
-      </w:r>
-      <w:r>
-        <w:rPr>
-          <w:rFonts w:hint="eastAsia"/>
-        </w:rPr>
-        <w:t>可以</w:t>
-      </w:r>
-      <w:r>
-        <w:rPr>
-          <w:rFonts w:hint="eastAsia"/>
-        </w:rPr>
-        <w:t>包含自身，例如目标为“本牌所在房间所有牌”的效果，</w:t>
-      </w:r>
-      <w:r>
-        <w:rPr>
-          <w:rFonts w:hint="eastAsia"/>
-        </w:rPr>
-        <w:t>目标中也包含发动该效果的牌。</w:t>
-      </w:r>
-    </w:p>
-    <w:p>
-      <w:pPr>
-        <w:pStyle w:val="3"/>
-        <w:rPr>
-          <w:rFonts w:hint="eastAsia"/>
-        </w:rPr>
-      </w:pPr>
-      <w:r>
-        <w:rPr>
-          <w:rFonts w:hint="eastAsia"/>
-        </w:rPr>
-        <w:t>结算队列</w:t>
-      </w:r>
-    </w:p>
-    <w:p>
-      <w:pPr>
-        <w:rPr>
-          <w:rFonts w:hint="eastAsia"/>
-        </w:rPr>
-      </w:pPr>
-      <w:r>
-        <w:tab/>
-      </w:r>
-      <w:r>
-        <w:rPr>
-          <w:rFonts w:hint="eastAsia"/>
-        </w:rPr>
-        <w:t>一个效果执行中时，如果满足了其他</w:t>
-      </w:r>
-      <w:r>
-        <w:rPr>
-          <w:rFonts w:hint="eastAsia"/>
-        </w:rPr>
-        <w:t>牌的</w:t>
-      </w:r>
-      <w:r>
-        <w:rPr>
-          <w:rFonts w:hint="eastAsia"/>
-        </w:rPr>
-        <w:t>效果的触发条件，</w:t>
-      </w:r>
-      <w:r>
-        <w:rPr>
-          <w:rFonts w:hint="eastAsia"/>
-        </w:rPr>
-        <w:t>则</w:t>
-      </w:r>
-      <w:r>
-        <w:rPr>
-          <w:rFonts w:hint="eastAsia"/>
-        </w:rPr>
-        <w:t>将其记录</w:t>
-      </w:r>
-      <w:r>
-        <w:rPr>
-          <w:rFonts w:hint="eastAsia"/>
-        </w:rPr>
-        <w:t>到队列中</w:t>
-      </w:r>
-      <w:r>
-        <w:rPr>
-          <w:rFonts w:hint="eastAsia"/>
-        </w:rPr>
-        <w:t>，</w:t>
-      </w:r>
-      <w:r>
-        <w:rPr>
-          <w:rFonts w:hint="eastAsia"/>
-        </w:rPr>
         <w:t>多张牌的效果的触发条件同时被满足时，</w:t>
       </w:r>
       <w:r>
         <w:rPr>
           <w:rFonts w:hint="eastAsia"/>
         </w:rPr>
-        <w:t>不在同一房间中的牌，按照所在房间在</w:t>
-      </w:r>
-      <w:r>
-        <w:rPr>
-          <w:rFonts w:hint="eastAsia"/>
-        </w:rPr>
-        <w:lastRenderedPageBreak/>
-        <w:t>楼层区的顺序，从上到下，从左到右，依次进入队列，在此基础上，在同一房间中的牌，按照标准顺序依次进入队列</w:t>
+        <w:t>不在同一房间中的牌，按照所在房间在楼层区的顺序，从上到下，从左到右，依次进入队列，在此基础上，在同一房间中的牌，按照标准顺序依次进入队列</w:t>
       </w:r>
       <w:r>
         <w:rPr>
@@ -7903,6 +8023,7 @@
         <w:rPr>
           <w:rFonts w:hint="eastAsia"/>
         </w:rPr>
+        <w:lastRenderedPageBreak/>
         <w:t>双人模式下，需要额外用到玩家指示物，每名玩家从玩家指示物堆中取一种颜色的指示物若干，之后需要使用更多玩家指示物时，再从该堆中取同样颜色的指示物。</w:t>
       </w:r>
     </w:p>
@@ -7983,296 +8104,384 @@
         <w:rPr>
           <w:rFonts w:hint="eastAsia"/>
         </w:rPr>
-        <w:t>两名玩家选好初始遗物牌后，按照先P1再P2的顺序，各自将未选中的遗物牌按</w:t>
-      </w:r>
+        <w:t>两名玩家选好初始遗物牌后，按照先P1再P2的顺序，各自将未选中的遗物牌按照任意顺序放到遗物牌堆底。</w:t>
+      </w:r>
+    </w:p>
+    <w:p>
+      <w:pPr>
+        <w:pStyle w:val="3"/>
+        <w:rPr>
+          <w:rFonts w:hint="eastAsia"/>
+        </w:rPr>
+      </w:pPr>
+      <w:r>
+        <w:rPr>
+          <w:rFonts w:hint="eastAsia"/>
+        </w:rPr>
+        <w:t>回合流程的变动</w:t>
+      </w:r>
+    </w:p>
+    <w:p>
+      <w:pPr>
+        <w:rPr>
+          <w:rFonts w:hint="eastAsia"/>
+        </w:rPr>
+      </w:pPr>
+      <w:r>
+        <w:tab/>
+      </w:r>
+      <w:r>
+        <w:rPr>
+          <w:rFonts w:hint="eastAsia"/>
+        </w:rPr>
+        <w:t>回合流程中，一部分操作需要两名玩家各自执行，一部分动作需要两名玩家选出一人执行。各自执行时，先后顺序均由两名玩家讨论决定，需要选出一名玩家执行时，执行者也由两名玩家讨论决定。意见不合的情况下，两人猜拳，由猜拳的胜者决定。</w:t>
+      </w:r>
+    </w:p>
+    <w:p>
+      <w:pPr>
+        <w:rPr>
+          <w:rFonts w:hint="eastAsia"/>
+        </w:rPr>
+      </w:pPr>
+      <w:r>
+        <w:tab/>
+      </w:r>
+      <w:r>
+        <w:rPr>
+          <w:rFonts w:hint="eastAsia"/>
+        </w:rPr>
+        <w:t>回合开始阶段，</w:t>
+      </w:r>
+      <w:r>
+        <w:rPr>
+          <w:rFonts w:hint="eastAsia"/>
+        </w:rPr>
+        <w:t>先选出一名玩家，由其负责主导本回合的行动。</w:t>
+      </w:r>
+      <w:r>
+        <w:rPr>
+          <w:rFonts w:hint="eastAsia"/>
+        </w:rPr>
+        <w:t>如果探索区没有牌，则两名玩家各自整理战利品</w:t>
+      </w:r>
+      <w:r>
+        <w:rPr>
+          <w:rFonts w:hint="eastAsia"/>
+        </w:rPr>
+        <w:t>，负责行动的玩家先执行</w:t>
+      </w:r>
+      <w:r>
+        <w:rPr>
+          <w:rFonts w:hint="eastAsia"/>
+        </w:rPr>
+        <w:t>，</w:t>
+      </w:r>
+      <w:r>
+        <w:rPr>
+          <w:rFonts w:hint="eastAsia"/>
+        </w:rPr>
+        <w:t>整理战利品时的规则相比单人规则有所变动，另作说明</w:t>
+      </w:r>
+      <w:r>
+        <w:rPr>
+          <w:rFonts w:hint="eastAsia"/>
+        </w:rPr>
+        <w:t>，之后，</w:t>
+      </w:r>
+      <w:r>
+        <w:rPr>
+          <w:rFonts w:hint="eastAsia"/>
+        </w:rPr>
+        <w:t>由</w:t>
+      </w:r>
+      <w:r>
+        <w:rPr>
+          <w:rFonts w:hint="eastAsia"/>
+        </w:rPr>
+        <w:t>负责行动的玩家</w:t>
+      </w:r>
+      <w:r>
+        <w:rPr>
+          <w:rFonts w:hint="eastAsia"/>
+        </w:rPr>
+        <w:t>决定先长休还是先重置探索区，长休时，两名玩家各自执行长休流程</w:t>
+      </w:r>
+      <w:r>
+        <w:rPr>
+          <w:rFonts w:hint="eastAsia"/>
+        </w:rPr>
+        <w:t>，仍旧是负责行动的玩家先执行</w:t>
+      </w:r>
+      <w:r>
+        <w:rPr>
+          <w:rFonts w:hint="eastAsia"/>
+        </w:rPr>
+        <w:t>。</w:t>
+      </w:r>
+      <w:r>
+        <w:rPr>
+          <w:rFonts w:hint="eastAsia"/>
+        </w:rPr>
+        <w:t>回合开始阶段中，</w:t>
+      </w:r>
+      <w:r>
+        <w:rPr>
+          <w:rFonts w:hint="eastAsia"/>
+        </w:rPr>
+        <w:t>如果探索区有牌发动效果，且那个效果指向玩家，则由负责行动的玩家承受。</w:t>
+      </w:r>
+    </w:p>
+    <w:p>
+      <w:pPr>
+        <w:rPr>
+          <w:rFonts w:hint="eastAsia"/>
+        </w:rPr>
+      </w:pPr>
+      <w:r>
+        <w:tab/>
+      </w:r>
+      <w:r>
+        <w:rPr>
+          <w:rFonts w:hint="eastAsia"/>
+        </w:rPr>
+        <w:t>负责行动的</w:t>
+      </w:r>
+      <w:r>
+        <w:rPr>
+          <w:rFonts w:hint="eastAsia"/>
+        </w:rPr>
+        <w:t>玩家</w:t>
+      </w:r>
+      <w:r>
+        <w:rPr>
+          <w:rFonts w:hint="eastAsia"/>
+        </w:rPr>
+        <w:t>选择短休或长休时，仅那名玩家使用自己的玩家面板执行相应流程，</w:t>
+      </w:r>
+      <w:r>
+        <w:rPr>
+          <w:rFonts w:hint="eastAsia"/>
+        </w:rPr>
+        <w:t>一切效果仅对那名玩家自己生效，如同另一名玩家不存在</w:t>
+      </w:r>
+      <w:r>
+        <w:rPr>
+          <w:rFonts w:hint="eastAsia"/>
+        </w:rPr>
+        <w:t>。</w:t>
+      </w:r>
+      <w:r>
+        <w:rPr>
+          <w:rFonts w:hint="eastAsia"/>
+        </w:rPr>
+        <w:t>例如，某个回合的行动阶段，两名玩家讨论决定由P1来行动，P1选择</w:t>
+      </w:r>
+      <w:r>
+        <w:rPr>
+          <w:rFonts w:hint="eastAsia"/>
+        </w:rPr>
+        <w:t>短</w:t>
+      </w:r>
+      <w:r>
+        <w:rPr>
+          <w:rFonts w:hint="eastAsia"/>
+        </w:rPr>
+        <w:t>休，此时消耗</w:t>
+      </w:r>
+      <w:r>
+        <w:rPr>
+          <w:rFonts w:hint="eastAsia"/>
+        </w:rPr>
+        <w:t>1</w:t>
+      </w:r>
+      <w:r>
+        <w:rPr>
+          <w:rFonts w:hint="eastAsia"/>
+        </w:rPr>
+        <w:t>时间，即将</w:t>
+      </w:r>
+      <w:r>
+        <w:rPr>
+          <w:rFonts w:hint="eastAsia"/>
+        </w:rPr>
+        <w:t>1</w:t>
+      </w:r>
+      <w:r>
+        <w:rPr>
+          <w:rFonts w:hint="eastAsia"/>
+        </w:rPr>
+        <w:t>张牌从主牌堆移动到P1玩家面板下的弃牌堆，</w:t>
+      </w:r>
+      <w:r>
+        <w:rPr>
+          <w:rFonts w:hint="eastAsia"/>
+        </w:rPr>
+        <w:t>然而，弃置的那一张牌是[掉宝地精]，触发了其“被弃置时，玩家将手牌补满”的效果，此时，效果文本中的“玩家”仅指当前行动的玩家，即P1，所以P1将自己的手牌补满，</w:t>
+      </w:r>
+      <w:r>
+        <w:rPr>
+          <w:rFonts w:hint="eastAsia"/>
+        </w:rPr>
+        <w:t>然后</w:t>
+      </w:r>
+      <w:r>
+        <w:rPr>
+          <w:rFonts w:hint="eastAsia"/>
+        </w:rPr>
+        <w:t>执行短休的流程重抽任意张手牌，整个流程中，P2的玩家面板不发生任何变化</w:t>
+      </w:r>
+      <w:r>
+        <w:rPr>
+          <w:rFonts w:hint="eastAsia"/>
+        </w:rPr>
+        <w:t>。</w:t>
+      </w:r>
+    </w:p>
+    <w:p>
+      <w:pPr>
+        <w:rPr>
+          <w:rFonts w:hint="eastAsia"/>
+        </w:rPr>
+      </w:pPr>
+      <w:r>
+        <w:tab/>
+      </w:r>
+      <w:r>
+        <w:rPr>
+          <w:rFonts w:hint="eastAsia"/>
+        </w:rPr>
+        <w:t>行动阶段的战斗流程变动较多，另作说明。</w:t>
+      </w:r>
+    </w:p>
+    <w:p>
+      <w:pPr>
+        <w:rPr>
+          <w:rFonts w:hint="eastAsia"/>
+        </w:rPr>
+      </w:pPr>
+      <w:r>
+        <w:tab/>
+      </w:r>
+      <w:r>
+        <w:rPr>
+          <w:rFonts w:hint="eastAsia"/>
+        </w:rPr>
+        <w:t>结束阶段检查下楼条件时，单人规则中的“玩家手中没有战利品外的牌”需调整为“所有玩家手中均没有战利品外的牌”。</w:t>
+      </w:r>
+      <w:r>
+        <w:rPr>
+          <w:rFonts w:hint="eastAsia"/>
+        </w:rPr>
+        <w:t>结束阶段发动的牌效果如有指向玩家的，处理方式和回合开始阶段的处理方式一致，都由当回合负责行动的玩家承受。</w:t>
+      </w:r>
+    </w:p>
+    <w:p>
+      <w:pPr>
+        <w:pStyle w:val="3"/>
+        <w:rPr>
+          <w:rFonts w:hint="eastAsia"/>
+        </w:rPr>
+      </w:pPr>
+      <w:r>
+        <w:rPr>
+          <w:rFonts w:hint="eastAsia"/>
+        </w:rPr>
+        <w:t>战斗的变动</w:t>
+      </w:r>
+    </w:p>
+    <w:p>
+      <w:pPr>
+        <w:ind w:firstLine="420"/>
+        <w:rPr>
+          <w:rFonts w:hint="eastAsia"/>
+        </w:rPr>
+      </w:pPr>
+      <w:r>
+        <w:rPr>
+          <w:rFonts w:hint="eastAsia"/>
+        </w:rPr>
+        <w:t>一名玩家出的牌为战场玩家侧某一行的第一张牌时，出牌的玩家在那一行放上自己的玩家指示物，以标记自己为这一行需要进行的战斗轮的主战者。</w:t>
+      </w:r>
+    </w:p>
+    <w:p>
+      <w:pPr>
+        <w:ind w:firstLine="420"/>
+        <w:rPr>
+          <w:rFonts w:hint="eastAsia"/>
+        </w:rPr>
+      </w:pPr>
       <w:r>
         <w:rPr>
           <w:rFonts w:hint="eastAsia"/>
         </w:rPr>
         <w:lastRenderedPageBreak/>
-        <w:t>照任意顺序放到遗物牌堆底。</w:t>
-      </w:r>
-    </w:p>
-    <w:p>
-      <w:pPr>
-        <w:pStyle w:val="3"/>
-        <w:rPr>
-          <w:rFonts w:hint="eastAsia"/>
-        </w:rPr>
-      </w:pPr>
-      <w:r>
-        <w:rPr>
-          <w:rFonts w:hint="eastAsia"/>
-        </w:rPr>
-        <w:t>回合流程的变动</w:t>
-      </w:r>
-    </w:p>
-    <w:p>
-      <w:pPr>
-        <w:rPr>
-          <w:rFonts w:hint="eastAsia"/>
-        </w:rPr>
-      </w:pPr>
-      <w:r>
-        <w:tab/>
-      </w:r>
-      <w:r>
-        <w:rPr>
-          <w:rFonts w:hint="eastAsia"/>
-        </w:rPr>
-        <w:t>回合流程中，一部分操作需要两名玩家各自执行，一部分动作需要两名玩家选出一人执行。各自执行时，先后顺序均由两名玩家讨论决定，需要选出一名玩家执行时，执行者也由两名玩家讨论决定。意见不合的情况下，两人猜拳，由猜拳的胜者决定。</w:t>
-      </w:r>
-    </w:p>
-    <w:p>
-      <w:pPr>
-        <w:rPr>
-          <w:rFonts w:hint="eastAsia"/>
-        </w:rPr>
-      </w:pPr>
-      <w:r>
-        <w:tab/>
-      </w:r>
-      <w:r>
-        <w:rPr>
-          <w:rFonts w:hint="eastAsia"/>
-        </w:rPr>
-        <w:t>回合开始阶段，</w:t>
-      </w:r>
-      <w:r>
-        <w:rPr>
-          <w:rFonts w:hint="eastAsia"/>
-        </w:rPr>
-        <w:t>先选出一名玩家，由其负责主导本回合的行动。</w:t>
-      </w:r>
-      <w:r>
-        <w:rPr>
-          <w:rFonts w:hint="eastAsia"/>
-        </w:rPr>
-        <w:t>如果探索区没有牌，则两名玩家各自整理战利品</w:t>
-      </w:r>
-      <w:r>
-        <w:rPr>
-          <w:rFonts w:hint="eastAsia"/>
-        </w:rPr>
-        <w:t>，负责行动的玩家先执行</w:t>
-      </w:r>
-      <w:r>
-        <w:rPr>
-          <w:rFonts w:hint="eastAsia"/>
-        </w:rPr>
-        <w:t>，</w:t>
-      </w:r>
-      <w:r>
-        <w:rPr>
-          <w:rFonts w:hint="eastAsia"/>
-        </w:rPr>
-        <w:t>整理战利品时的规则相比单人规则有所变动，另作说明</w:t>
-      </w:r>
-      <w:r>
-        <w:rPr>
-          <w:rFonts w:hint="eastAsia"/>
-        </w:rPr>
-        <w:t>，之后，</w:t>
-      </w:r>
-      <w:r>
-        <w:rPr>
-          <w:rFonts w:hint="eastAsia"/>
-        </w:rPr>
-        <w:t>由</w:t>
-      </w:r>
-      <w:r>
-        <w:rPr>
-          <w:rFonts w:hint="eastAsia"/>
-        </w:rPr>
-        <w:t>负责行动的玩家</w:t>
-      </w:r>
-      <w:r>
-        <w:rPr>
-          <w:rFonts w:hint="eastAsia"/>
-        </w:rPr>
-        <w:t>决定先长休还是先重置探索区，长休时，两名玩家各自执行长休流程</w:t>
-      </w:r>
-      <w:r>
-        <w:rPr>
-          <w:rFonts w:hint="eastAsia"/>
-        </w:rPr>
-        <w:t>，仍旧是负责行动的玩家先执行</w:t>
-      </w:r>
-      <w:r>
-        <w:rPr>
-          <w:rFonts w:hint="eastAsia"/>
-        </w:rPr>
-        <w:t>。</w:t>
-      </w:r>
-      <w:r>
-        <w:rPr>
-          <w:rFonts w:hint="eastAsia"/>
-        </w:rPr>
-        <w:t>回合开始阶段中，</w:t>
-      </w:r>
-      <w:r>
-        <w:rPr>
-          <w:rFonts w:hint="eastAsia"/>
-        </w:rPr>
-        <w:t>如果探索区有牌发动效果，且那个效果指向玩家，则由负责行动的玩家承受。</w:t>
-      </w:r>
-    </w:p>
-    <w:p>
-      <w:pPr>
-        <w:rPr>
-          <w:rFonts w:hint="eastAsia"/>
-        </w:rPr>
-      </w:pPr>
-      <w:r>
-        <w:tab/>
-      </w:r>
-      <w:r>
-        <w:rPr>
-          <w:rFonts w:hint="eastAsia"/>
-        </w:rPr>
-        <w:t>负责行动的</w:t>
-      </w:r>
-      <w:r>
-        <w:rPr>
-          <w:rFonts w:hint="eastAsia"/>
-        </w:rPr>
-        <w:t>玩家</w:t>
-      </w:r>
-      <w:r>
-        <w:rPr>
-          <w:rFonts w:hint="eastAsia"/>
-        </w:rPr>
-        <w:t>选择短休或长休时，仅那名玩家使用自己的玩家面板执行相应流程，</w:t>
-      </w:r>
-      <w:r>
-        <w:rPr>
-          <w:rFonts w:hint="eastAsia"/>
-        </w:rPr>
-        <w:t>一切效果仅对那名玩家自己生效，如同另一名玩家不存在</w:t>
-      </w:r>
-      <w:r>
-        <w:rPr>
-          <w:rFonts w:hint="eastAsia"/>
-        </w:rPr>
-        <w:t>。</w:t>
-      </w:r>
-      <w:r>
-        <w:rPr>
-          <w:rFonts w:hint="eastAsia"/>
-        </w:rPr>
-        <w:t>例如，某个回合的行动阶段，两名玩家讨论决定由P1来行动，P1选择</w:t>
-      </w:r>
-      <w:r>
-        <w:rPr>
-          <w:rFonts w:hint="eastAsia"/>
-        </w:rPr>
-        <w:t>短</w:t>
-      </w:r>
-      <w:r>
-        <w:rPr>
-          <w:rFonts w:hint="eastAsia"/>
-        </w:rPr>
-        <w:t>休，此时消耗</w:t>
-      </w:r>
-      <w:r>
-        <w:rPr>
-          <w:rFonts w:hint="eastAsia"/>
-        </w:rPr>
-        <w:t>1</w:t>
-      </w:r>
-      <w:r>
-        <w:rPr>
-          <w:rFonts w:hint="eastAsia"/>
-        </w:rPr>
-        <w:t>时间，即将</w:t>
-      </w:r>
-      <w:r>
-        <w:rPr>
-          <w:rFonts w:hint="eastAsia"/>
-        </w:rPr>
-        <w:t>1</w:t>
-      </w:r>
-      <w:r>
-        <w:rPr>
-          <w:rFonts w:hint="eastAsia"/>
-        </w:rPr>
-        <w:t>张牌从主牌堆移动到P1玩家面板下的弃牌堆，</w:t>
-      </w:r>
-      <w:r>
-        <w:rPr>
-          <w:rFonts w:hint="eastAsia"/>
-        </w:rPr>
-        <w:t>然而，弃置的那一张牌是[掉宝地精]，触发了其“被弃置时，玩家将手牌补满”的效果，此时，效果文本中的“玩家”仅指当前行动的玩家，即P1，所以P1将自己的手牌补满，</w:t>
-      </w:r>
-      <w:r>
-        <w:rPr>
-          <w:rFonts w:hint="eastAsia"/>
-        </w:rPr>
-        <w:t>然后</w:t>
-      </w:r>
-      <w:r>
-        <w:rPr>
-          <w:rFonts w:hint="eastAsia"/>
-        </w:rPr>
-        <w:t>执行短休的流程重抽任意张手牌，整个流程中，P2的玩家面板不发生任何变化</w:t>
-      </w:r>
-      <w:r>
-        <w:rPr>
-          <w:rFonts w:hint="eastAsia"/>
-        </w:rPr>
-        <w:t>。</w:t>
-      </w:r>
-    </w:p>
-    <w:p>
-      <w:pPr>
-        <w:rPr>
-          <w:rFonts w:hint="eastAsia"/>
-        </w:rPr>
-      </w:pPr>
-      <w:r>
-        <w:tab/>
-      </w:r>
-      <w:r>
-        <w:rPr>
-          <w:rFonts w:hint="eastAsia"/>
-        </w:rPr>
-        <w:t>行动阶段的战斗流程变动较多，另作说明。</w:t>
-      </w:r>
-    </w:p>
-    <w:p>
-      <w:pPr>
-        <w:rPr>
-          <w:rFonts w:hint="eastAsia"/>
-        </w:rPr>
-      </w:pPr>
-      <w:r>
-        <w:tab/>
-      </w:r>
-      <w:r>
-        <w:rPr>
-          <w:rFonts w:hint="eastAsia"/>
-        </w:rPr>
-        <w:t>结束阶段检查下楼条件时，单人规则中的“玩家手中没有战利品外的牌”需调整为“所有玩家手中均没有战利品外的牌”。</w:t>
-      </w:r>
-      <w:r>
-        <w:rPr>
-          <w:rFonts w:hint="eastAsia"/>
-        </w:rPr>
-        <w:t>结束阶段发动的牌效果如有指向玩家的，处理方式和回合开始阶段的处理方式一致，都由当回合负责行动的玩家承受。</w:t>
-      </w:r>
-    </w:p>
-    <w:p>
-      <w:pPr>
-        <w:pStyle w:val="3"/>
-        <w:rPr>
-          <w:rFonts w:hint="eastAsia"/>
-        </w:rPr>
-      </w:pPr>
-      <w:r>
-        <w:rPr>
-          <w:rFonts w:hint="eastAsia"/>
-        </w:rPr>
-        <w:t>战斗的变动</w:t>
+        <w:t>负责执行行动的玩家在行动阶段选择进入战斗后，由那名玩家选探索区一列牌移入战场敌对侧，这里假设那名玩家是P1。之后，P1从手牌出牌到战场玩家侧自己那一列的某一行。P1可以一次出多张牌，但只能在一行里出牌。P1出完牌后，轮到P2出牌，</w:t>
+      </w:r>
+      <w:r>
+        <w:rPr>
+          <w:rFonts w:hint="eastAsia"/>
+        </w:rPr>
+        <w:t>但</w:t>
+      </w:r>
+      <w:r>
+        <w:rPr>
+          <w:rFonts w:hint="eastAsia"/>
+        </w:rPr>
+        <w:t>只能将牌出在P1刚才出牌的那一行的同一行或更靠近顶端的行</w:t>
+      </w:r>
+      <w:r>
+        <w:rPr>
+          <w:rFonts w:hint="eastAsia"/>
+        </w:rPr>
+        <w:t>，其他出牌规则同P1，如果</w:t>
+      </w:r>
+      <w:r>
+        <w:rPr>
+          <w:rFonts w:hint="eastAsia"/>
+        </w:rPr>
+        <w:t>P2选择将牌出在P1出牌的</w:t>
+      </w:r>
+      <w:r>
+        <w:rPr>
+          <w:rFonts w:hint="eastAsia"/>
+        </w:rPr>
+        <w:t>新的</w:t>
+      </w:r>
+      <w:r>
+        <w:rPr>
+          <w:rFonts w:hint="eastAsia"/>
+        </w:rPr>
+        <w:t>一行，则P2</w:t>
+      </w:r>
+      <w:r>
+        <w:rPr>
+          <w:rFonts w:hint="eastAsia"/>
+        </w:rPr>
+        <w:t>同样地</w:t>
+      </w:r>
+      <w:r>
+        <w:rPr>
+          <w:rFonts w:hint="eastAsia"/>
+        </w:rPr>
+        <w:t>成为</w:t>
+      </w:r>
+      <w:r>
+        <w:rPr>
+          <w:rFonts w:hint="eastAsia"/>
+        </w:rPr>
+        <w:t>新的那</w:t>
+      </w:r>
+      <w:r>
+        <w:rPr>
+          <w:rFonts w:hint="eastAsia"/>
+        </w:rPr>
+        <w:t>一行的</w:t>
+      </w:r>
+      <w:r>
+        <w:rPr>
+          <w:rFonts w:hint="eastAsia"/>
+        </w:rPr>
+        <w:t>主战者，之后又轮到P1出牌，以此往复直到某一名玩家决定停止出牌。一名玩家停止出牌后，另一名玩家也不能继续出牌了。</w:t>
       </w:r>
     </w:p>
     <w:p>
@@ -8286,101 +8495,6 @@
         <w:rPr>
           <w:rFonts w:hint="eastAsia"/>
         </w:rPr>
-        <w:t>一名玩家出的牌为战场玩家侧某一行的第一张牌时，出牌的玩家在那一行放上自己的玩家指示物，以标记自己为这一行需要进行的战斗轮的主战者。</w:t>
-      </w:r>
-    </w:p>
-    <w:p>
-      <w:pPr>
-        <w:ind w:firstLine="420"/>
-        <w:rPr>
-          <w:rFonts w:hint="eastAsia"/>
-        </w:rPr>
-      </w:pPr>
-      <w:r>
-        <w:rPr>
-          <w:rFonts w:hint="eastAsia"/>
-        </w:rPr>
-        <w:t>负责执行行动的玩家在行动阶段选择进入战斗后，由那名玩家选探索区一列牌移入战场敌对侧，这里假设那名玩家是P1。之后，P1从手牌出牌到战场玩家侧自己那一列的某一行。P1可以一次出多张牌，但只能在一行里出牌。P1出完牌后，轮到P2出牌，</w:t>
-      </w:r>
-      <w:r>
-        <w:rPr>
-          <w:rFonts w:hint="eastAsia"/>
-        </w:rPr>
-        <w:t>但</w:t>
-      </w:r>
-      <w:r>
-        <w:rPr>
-          <w:rFonts w:hint="eastAsia"/>
-        </w:rPr>
-        <w:t>只能将牌出在P1刚才出牌的那一行的同一行或更靠近顶端的行</w:t>
-      </w:r>
-      <w:r>
-        <w:rPr>
-          <w:rFonts w:hint="eastAsia"/>
-        </w:rPr>
-        <w:t>，其他出牌规则同P1，如果</w:t>
-      </w:r>
-      <w:r>
-        <w:rPr>
-          <w:rFonts w:hint="eastAsia"/>
-        </w:rPr>
-        <w:t>P2选择将牌出在P1出牌的</w:t>
-      </w:r>
-      <w:r>
-        <w:rPr>
-          <w:rFonts w:hint="eastAsia"/>
-        </w:rPr>
-        <w:t>新的</w:t>
-      </w:r>
-      <w:r>
-        <w:rPr>
-          <w:rFonts w:hint="eastAsia"/>
-        </w:rPr>
-        <w:t>一行，则P2</w:t>
-      </w:r>
-      <w:r>
-        <w:rPr>
-          <w:rFonts w:hint="eastAsia"/>
-        </w:rPr>
-        <w:t>同样地</w:t>
-      </w:r>
-      <w:r>
-        <w:rPr>
-          <w:rFonts w:hint="eastAsia"/>
-        </w:rPr>
-        <w:t>成为</w:t>
-      </w:r>
-      <w:r>
-        <w:rPr>
-          <w:rFonts w:hint="eastAsia"/>
-        </w:rPr>
-        <w:t>新的那</w:t>
-      </w:r>
-      <w:r>
-        <w:rPr>
-          <w:rFonts w:hint="eastAsia"/>
-        </w:rPr>
-        <w:t>一行的</w:t>
-      </w:r>
-      <w:r>
-        <w:rPr>
-          <w:rFonts w:hint="eastAsia"/>
-        </w:rPr>
-        <w:t>主战者，之后又轮到P1出牌，以此往复直到某一名玩家决定停止出牌。一名玩家停止出牌后，另一名玩家也不能继续出牌了。</w:t>
-      </w:r>
-    </w:p>
-    <w:p>
-      <w:pPr>
-        <w:ind w:firstLine="420"/>
-        <w:rPr>
-          <w:rFonts w:hint="eastAsia"/>
-        </w:rPr>
-      </w:pPr>
-      <w:r>
-        <w:rPr>
-          <w:rFonts w:hint="eastAsia"/>
-        </w:rPr>
-        <w:lastRenderedPageBreak/>
         <w:t>两名玩家出完牌后，战场两侧的合计点数仍按单人规则计算。</w:t>
       </w:r>
       <w:r>

</xml_diff>